<commit_message>
atualiza sistema_vampiro_completo.docx com as regras novas
</commit_message>
<xml_diff>
--- a/sistema_vampiro_completo.docx
+++ b/sistema_vampiro_completo.docx
@@ -52,7 +52,7 @@
         <w:spacing w:after="150"/>
       </w:pPr>
       <w:r>
-        <w:t xml:space="preserve">Este documento reúne toda a estrutura mecânica fechada até agora: atributos, recursos, perícias, perícias especiais, disciplinas vampíricas, magia, combate, inventário, raça vampiro, classes e o esboço de honra/reputação. A ficha de personagem terá duas partes distintas: a ficha sistemática (números e mecânicas, descrita aqui) e a ficha de lore (biografia e personalidade), a ser feita em documento separado. Economia, sistema de XP/nível e a versão em site ainda estão em desenvolvimento.</w:t>
+        <w:t>Este documento reúne toda a estrutura mecânica fechada até agora: atributos, recursos, perícias, perícias especiais, disciplinas vampíricas, magia, combate, inventário, raças, classe social, classes, progressão por XP e o esboço de honra/reputação. O bot de Discord, que automatiza a ficha, tem capítulo próprio. A ficha de personagem terá duas partes distintas: a ficha sistemática (números e mecânicas, descrita aqui) e a ficha de lore (biografia e personalidade), a ser feita em documento separado. Economia ainda está em desenvolvimento.</w:t>
       </w:r>
     </w:p>
     <w:p>
@@ -347,6 +347,14 @@
     </w:p>
     <w:p>
       <w:pPr>
+        <w:spacing w:after="150"/>
+      </w:pPr>
+      <w:r>
+        <w:t xml:space="preserve">Os limites de atributo do Dhampir ainda não foram definidos (ver Em Aberto).</w:t>
+      </w:r>
+    </w:p>
+    <w:p>
+      <w:pPr>
         <w:spacing w:after="60" w:before="150"/>
       </w:pPr>
       <w:r>
@@ -588,6 +596,214 @@
     </w:p>
     <w:p>
       <w:pPr>
+        <w:pStyle w:val="Heading2"/>
+        <w:spacing w:after="150" w:before="300"/>
+      </w:pPr>
+      <w:r>
+        <w:t xml:space="preserve">Quanto vale cada ponto</w:t>
+      </w:r>
+    </w:p>
+    <w:tbl>
+      <w:tblPr>
+        <w:tblW w:w="9638" w:type="dxa"/>
+        <w:tblBorders>
+          <w:top w:val="single" w:sz="4" w:space="0" w:color="auto"/>
+          <w:left w:val="single" w:sz="4" w:space="0" w:color="auto"/>
+          <w:bottom w:val="single" w:sz="4" w:space="0" w:color="auto"/>
+          <w:right w:val="single" w:sz="4" w:space="0" w:color="auto"/>
+          <w:insideH w:val="single" w:sz="4" w:space="0" w:color="auto"/>
+          <w:insideV w:val="single" w:sz="4" w:space="0" w:color="auto"/>
+        </w:tblBorders>
+        <w:tblLayout w:type="fixed"/>
+      </w:tblPr>
+      <w:tblGrid>
+        <w:gridCol w:w="2891"/>
+        <w:gridCol w:w="6747"/>
+      </w:tblGrid>
+      <w:tr>
+        <w:tc>
+          <w:tcPr>
+            <w:tcW w:w="2891" w:type="dxa"/>
+          </w:tcPr>
+          <w:p>
+            <w:pPr>
+              <w:spacing w:after="0"/>
+            </w:pPr>
+            <w:r>
+              <w:rPr>
+                <w:b/>
+                <w:bCs/>
+              </w:rPr>
+              <w:t xml:space="preserve">Atributo</w:t>
+            </w:r>
+          </w:p>
+        </w:tc>
+        <w:tc>
+          <w:tcPr>
+            <w:tcW w:w="6747" w:type="dxa"/>
+          </w:tcPr>
+          <w:p>
+            <w:pPr>
+              <w:spacing w:after="0"/>
+            </w:pPr>
+            <w:r>
+              <w:rPr>
+                <w:b/>
+                <w:bCs/>
+              </w:rPr>
+              <w:t xml:space="preserve">Cada ponto dá</w:t>
+            </w:r>
+          </w:p>
+        </w:tc>
+      </w:tr>
+      <w:tr>
+        <w:tc>
+          <w:tcPr>
+            <w:tcW w:w="2891" w:type="dxa"/>
+          </w:tcPr>
+          <w:p>
+            <w:pPr>
+              <w:spacing w:after="0"/>
+            </w:pPr>
+            <w:r>
+              <w:t xml:space="preserve">Vitalidade</w:t>
+            </w:r>
+          </w:p>
+        </w:tc>
+        <w:tc>
+          <w:tcPr>
+            <w:tcW w:w="6747" w:type="dxa"/>
+          </w:tcPr>
+          <w:p>
+            <w:pPr>
+              <w:spacing w:after="0"/>
+            </w:pPr>
+            <w:r>
+              <w:t xml:space="preserve">+5 Vida e +3 Estamina</w:t>
+            </w:r>
+          </w:p>
+        </w:tc>
+      </w:tr>
+      <w:tr>
+        <w:tc>
+          <w:tcPr>
+            <w:tcW w:w="2891" w:type="dxa"/>
+          </w:tcPr>
+          <w:p>
+            <w:pPr>
+              <w:spacing w:after="0"/>
+            </w:pPr>
+            <w:r>
+              <w:t xml:space="preserve">Vontade</w:t>
+            </w:r>
+          </w:p>
+        </w:tc>
+        <w:tc>
+          <w:tcPr>
+            <w:tcW w:w="6747" w:type="dxa"/>
+          </w:tcPr>
+          <w:p>
+            <w:pPr>
+              <w:spacing w:after="0"/>
+            </w:pPr>
+            <w:r>
+              <w:t xml:space="preserve">+5 Sanidade e +3 Mana</w:t>
+            </w:r>
+          </w:p>
+        </w:tc>
+      </w:tr>
+      <w:tr>
+        <w:tc>
+          <w:tcPr>
+            <w:tcW w:w="2891" w:type="dxa"/>
+          </w:tcPr>
+          <w:p>
+            <w:pPr>
+              <w:spacing w:after="0"/>
+            </w:pPr>
+            <w:r>
+              <w:t xml:space="preserve">Alma</w:t>
+            </w:r>
+          </w:p>
+        </w:tc>
+        <w:tc>
+          <w:tcPr>
+            <w:tcW w:w="6747" w:type="dxa"/>
+          </w:tcPr>
+          <w:p>
+            <w:pPr>
+              <w:spacing w:after="0"/>
+            </w:pPr>
+            <w:r>
+              <w:t xml:space="preserve">+3 Mana</w:t>
+            </w:r>
+          </w:p>
+        </w:tc>
+      </w:tr>
+      <w:tr>
+        <w:tc>
+          <w:tcPr>
+            <w:tcW w:w="2891" w:type="dxa"/>
+          </w:tcPr>
+          <w:p>
+            <w:pPr>
+              <w:spacing w:after="0"/>
+            </w:pPr>
+            <w:r>
+              <w:t xml:space="preserve">Força</w:t>
+            </w:r>
+          </w:p>
+        </w:tc>
+        <w:tc>
+          <w:tcPr>
+            <w:tcW w:w="6747" w:type="dxa"/>
+          </w:tcPr>
+          <w:p>
+            <w:pPr>
+              <w:spacing w:after="0"/>
+            </w:pPr>
+            <w:r>
+              <w:t xml:space="preserve">+3 Estamina</w:t>
+            </w:r>
+          </w:p>
+        </w:tc>
+      </w:tr>
+    </w:tbl>
+    <w:p>
+      <w:pPr>
+        <w:spacing w:after="150" w:before="120"/>
+      </w:pPr>
+      <w:r>
+        <w:t xml:space="preserve">Destreza e Razão não entram nas contas de recursos.</w:t>
+      </w:r>
+    </w:p>
+    <w:p>
+      <w:pPr>
+        <w:pStyle w:val="Heading2"/>
+        <w:spacing w:after="150" w:before="300"/>
+      </w:pPr>
+      <w:r>
+        <w:t xml:space="preserve">Ajustando a Vida ao subir de nível</w:t>
+      </w:r>
+    </w:p>
+    <w:p>
+      <w:pPr>
+        <w:spacing w:after="150"/>
+      </w:pPr>
+      <w:r>
+        <w:t xml:space="preserve">O jogador distribui os pontos de atributo que ganhou e recalcula os recursos. Cada ponto que vai pra Vitalidade soma +5 na Vida e +3 na Estamina; o nível em si não dá Vida.</w:t>
+      </w:r>
+    </w:p>
+    <w:p>
+      <w:pPr>
+        <w:spacing w:after="150"/>
+      </w:pPr>
+      <w:r>
+        <w:t xml:space="preserve">O bot de Discord faz o mesmo cálculo de duas formas: o /calcular_recursos serve pra simular com os números que o jogador digitar, e o /minha_ficha já mostra Vida, Sanidade, Mana e Estamina reais do personagem, recalculados sozinhos quando ele aumenta um atributo.</w:t>
+      </w:r>
+    </w:p>
+    <w:p>
+      <w:pPr>
         <w:pStyle w:val="Heading1"/>
         <w:spacing w:after="200" w:before="400"/>
       </w:pPr>
@@ -989,7 +1205,7 @@
         <w:spacing w:after="150"/>
       </w:pPr>
       <w:r>
-        <w:t xml:space="preserve">Ritualismo, Alquimia, Forja, Culinária e Fé não são compradas com pontos na criação. Funcionam como um sistema de permissão, não de bônus: o grau representa o que o personagem é realmente capaz de fazer. Sem nenhum grau, o personagem não sabe fazer aquilo. Pode tentar, mas o risco de um resultado desastroso é alto.</w:t>
+        <w:t>Ritualismo, Alquimia, Forja, Culinária e Fé não são compradas com pontos na criação. Funcionam como um sistema de permissão, não de bônus: o Rank representa o que o personagem é realmente capaz de fazer. Sem nenhum Rank, o personagem não sabe fazer aquilo. Pode tentar, mas o risco de um resultado desastroso é alto.</w:t>
       </w:r>
     </w:p>
     <w:p>
@@ -997,7 +1213,7 @@
         <w:spacing w:after="150"/>
       </w:pPr>
       <w:r>
-        <w:t xml:space="preserve">Cada perícia especial tem 10 graus (1 = básico, 10 = maestria completa). O progresso é adquirido ao longo do RP, em cenas em que o personagem pratica ou demonstra a habilidade. Conceder um grau novo é decisão do mestre. Um personagem com histórico ligado a uma dessas áreas pode começar já com grau inicial, conforme sua classe.</w:t>
+        <w:t>Cada perícia especial vai do Rank 0 ao 10 (0 = não saber fazer, 1 = básico, 10 = maestria completa). O progresso é adquirido ao longo do RP, em cenas em que o personagem pratica ou demonstra a habilidade. Conceder um Rank novo é decisão dos mestres. Um personagem com histórico ligado a uma dessas áreas pode começar já com Rank inicial, conforme sua classe.</w:t>
       </w:r>
     </w:p>
     <w:p>
@@ -1114,7 +1330,7 @@
         <w:spacing w:after="150"/>
       </w:pPr>
       <w:r>
-        <w:t xml:space="preserve">Poderes sobrenaturais exclusivos de vampiros, o equivalente a uma característica “genética” da condição vampírica. Uma Disciplina não é testada sozinha: não existe “teste de Disciplina”. Ela é uma capacidade nata, sempre presente, que faz duas coisas: destrava o que o vampiro consegue fazer (Grau 0 = não tem o poder) e dá bônus nos testes ligados a ela (+1 por grau, mais vantagem: rola dois dados e fica com o melhor).</w:t>
+        <w:t>Poderes sobrenaturais exclusivos de vampiros e dhampirs, o equivalente a uma característica “genética” da condição vampírica. Uma Disciplina não é testada sozinha: não existe “teste de Disciplina”. Ela é uma capacidade nata, sempre presente, que faz duas coisas: destrava o que o vampiro consegue fazer (Grau 0 = não tem o poder) e dá bônus nos testes ligados a ela (+1 por grau, mais vantagem: rola dois dados e fica com o melhor).</w:t>
       </w:r>
     </w:p>
     <w:p>
@@ -1122,7 +1338,22 @@
         <w:spacing w:after="150"/>
       </w:pPr>
       <w:r>
-        <w:t xml:space="preserve">Na criação da ficha, o vampiro recebe 4 pontos para distribuir entre as Disciplinas (1 ponto = 1 grau). O grau máximo permitido na criação é 3. Os graus 4 e 5 só são conquistados depois, durante o jogo.</w:t>
+        <w:t>Na criação da ficha, o vampiro recebe 4 pontos para distribuir entre as Disciplinas (1 ponto = 1 grau), e o dhampir recebe 3. O grau máximo permitido na criação é 3. Os graus 4 e 5 só são conquistados depois, durante o jogo.</w:t>
+      </w:r>
+    </w:p>
+    <w:p>
+      <w:pPr>
+        <w:spacing w:after="150"/>
+      </w:pPr>
+      <w:r>
+        <w:rPr>
+          <w:b/>
+          <w:bCs/>
+        </w:rPr>
+        <w:t xml:space="preserve">Pontos por nível: </w:t>
+      </w:r>
+      <w:r>
+        <w:t xml:space="preserve">vampiros e dhampirs ganham +1 ponto de Disciplina a cada 2 níveis (níveis 2, 4, 6, 8 e 10), pra distribuir nas Disciplinas. Isso se soma à regra de que os graus 4 e 5 só são conquistados durante o jogo. Humanos não ganham esse ponto.</w:t>
       </w:r>
     </w:p>
     <w:p>
@@ -1795,7 +2026,7 @@
         <w:spacing w:after="120"/>
       </w:pPr>
       <w:r>
-        <w:t xml:space="preserve">Concedida por uma força celestial ou sagrada. Exclusiva de clero e nobreza com Fé suficiente para desbloquear o acesso. Não pode ser criada por conta própria a menos que o personagem faça parte do clero; só pode ser ensinada. O Rank dela acompanha o Rank da perícia especial Fé.</w:t>
+        <w:t>Concedida por uma força celestial ou sagrada. Exclusiva de clero e nobreza com Fé suficiente para desbloquear o acesso (ver Classe Social). Não pode ser criada por conta própria a menos que o personagem faça parte do clero; só pode ser ensinada. O Rank dela acompanha o Rank da perícia especial Fé.</w:t>
       </w:r>
     </w:p>
     <w:p>
@@ -3308,7 +3539,7 @@
         <w:spacing w:after="200" w:before="400"/>
       </w:pPr>
       <w:r>
-        <w:t xml:space="preserve">11. Inventário</w:t>
+        <w:t>10. Inventário</w:t>
       </w:r>
     </w:p>
     <w:p>
@@ -3333,15 +3564,7 @@
         <w:spacing w:after="200" w:before="400"/>
       </w:pPr>
       <w:r>
-        <w:t xml:space="preserve">10. Raça Vampiro</w:t>
-      </w:r>
-    </w:p>
-    <w:p>
-      <w:pPr>
-        <w:spacing w:after="150"/>
-      </w:pPr>
-      <w:r>
-        <w:t xml:space="preserve">Limites de atributo: Força, Destreza e Vitalidade até 5 (contra 3 do humano). Razão, Vontade e Alma seguem sem limite definido.</w:t>
+        <w:t>11. Raças</w:t>
       </w:r>
     </w:p>
     <w:p>
@@ -3350,7 +3573,253 @@
         <w:spacing w:after="150" w:before="300"/>
       </w:pPr>
       <w:r>
-        <w:t xml:space="preserve">Fraquezas</w:t>
+        <w:t xml:space="preserve">Sorteio de Raça</w:t>
+      </w:r>
+    </w:p>
+    <w:p>
+      <w:pPr>
+        <w:spacing w:after="150"/>
+      </w:pPr>
+      <w:r>
+        <w:t xml:space="preserve">Rolado em 1d100 na criação, uma vez só por personagem.</w:t>
+      </w:r>
+    </w:p>
+    <w:tbl>
+      <w:tblPr>
+        <w:tblW w:w="9638" w:type="dxa"/>
+        <w:tblBorders>
+          <w:top w:val="single" w:sz="4" w:space="0" w:color="auto"/>
+          <w:left w:val="single" w:sz="4" w:space="0" w:color="auto"/>
+          <w:bottom w:val="single" w:sz="4" w:space="0" w:color="auto"/>
+          <w:right w:val="single" w:sz="4" w:space="0" w:color="auto"/>
+          <w:insideH w:val="single" w:sz="4" w:space="0" w:color="auto"/>
+          <w:insideV w:val="single" w:sz="4" w:space="0" w:color="auto"/>
+        </w:tblBorders>
+        <w:tblLayout w:type="fixed"/>
+      </w:tblPr>
+      <w:tblGrid>
+        <w:gridCol w:w="3213"/>
+        <w:gridCol w:w="3213"/>
+        <w:gridCol w:w="3212"/>
+      </w:tblGrid>
+      <w:tr>
+        <w:tc>
+          <w:tcPr>
+            <w:tcW w:w="3213" w:type="dxa"/>
+          </w:tcPr>
+          <w:p>
+            <w:pPr>
+              <w:spacing w:after="0"/>
+            </w:pPr>
+            <w:r>
+              <w:rPr>
+                <w:b/>
+                <w:bCs/>
+              </w:rPr>
+              <w:t xml:space="preserve">Raça</w:t>
+            </w:r>
+          </w:p>
+        </w:tc>
+        <w:tc>
+          <w:tcPr>
+            <w:tcW w:w="3213" w:type="dxa"/>
+          </w:tcPr>
+          <w:p>
+            <w:pPr>
+              <w:spacing w:after="0"/>
+            </w:pPr>
+            <w:r>
+              <w:rPr>
+                <w:b/>
+                <w:bCs/>
+              </w:rPr>
+              <w:t xml:space="preserve">Resultado no 1d100</w:t>
+            </w:r>
+          </w:p>
+        </w:tc>
+        <w:tc>
+          <w:tcPr>
+            <w:tcW w:w="3212" w:type="dxa"/>
+          </w:tcPr>
+          <w:p>
+            <w:pPr>
+              <w:spacing w:after="0"/>
+            </w:pPr>
+            <w:r>
+              <w:rPr>
+                <w:b/>
+                <w:bCs/>
+              </w:rPr>
+              <w:t xml:space="preserve">Chance</w:t>
+            </w:r>
+          </w:p>
+        </w:tc>
+      </w:tr>
+      <w:tr>
+        <w:tc>
+          <w:tcPr>
+            <w:tcW w:w="3213" w:type="dxa"/>
+          </w:tcPr>
+          <w:p>
+            <w:pPr>
+              <w:spacing w:after="0"/>
+            </w:pPr>
+            <w:r>
+              <w:t xml:space="preserve">Humano</w:t>
+            </w:r>
+          </w:p>
+        </w:tc>
+        <w:tc>
+          <w:tcPr>
+            <w:tcW w:w="3213" w:type="dxa"/>
+          </w:tcPr>
+          <w:p>
+            <w:pPr>
+              <w:spacing w:after="0"/>
+            </w:pPr>
+            <w:r>
+              <w:t xml:space="preserve">1–85</w:t>
+            </w:r>
+          </w:p>
+        </w:tc>
+        <w:tc>
+          <w:tcPr>
+            <w:tcW w:w="3212" w:type="dxa"/>
+          </w:tcPr>
+          <w:p>
+            <w:pPr>
+              <w:spacing w:after="0"/>
+            </w:pPr>
+            <w:r>
+              <w:t xml:space="preserve">85%</w:t>
+            </w:r>
+          </w:p>
+        </w:tc>
+      </w:tr>
+      <w:tr>
+        <w:tc>
+          <w:tcPr>
+            <w:tcW w:w="3213" w:type="dxa"/>
+          </w:tcPr>
+          <w:p>
+            <w:pPr>
+              <w:spacing w:after="0"/>
+            </w:pPr>
+            <w:r>
+              <w:t xml:space="preserve">Vampiro</w:t>
+            </w:r>
+          </w:p>
+        </w:tc>
+        <w:tc>
+          <w:tcPr>
+            <w:tcW w:w="3213" w:type="dxa"/>
+          </w:tcPr>
+          <w:p>
+            <w:pPr>
+              <w:spacing w:after="0"/>
+            </w:pPr>
+            <w:r>
+              <w:t xml:space="preserve">86–95</w:t>
+            </w:r>
+          </w:p>
+        </w:tc>
+        <w:tc>
+          <w:tcPr>
+            <w:tcW w:w="3212" w:type="dxa"/>
+          </w:tcPr>
+          <w:p>
+            <w:pPr>
+              <w:spacing w:after="0"/>
+            </w:pPr>
+            <w:r>
+              <w:t xml:space="preserve">10%</w:t>
+            </w:r>
+          </w:p>
+        </w:tc>
+      </w:tr>
+      <w:tr>
+        <w:tc>
+          <w:tcPr>
+            <w:tcW w:w="3213" w:type="dxa"/>
+          </w:tcPr>
+          <w:p>
+            <w:pPr>
+              <w:spacing w:after="0"/>
+            </w:pPr>
+            <w:r>
+              <w:t xml:space="preserve">Dhampir</w:t>
+            </w:r>
+          </w:p>
+        </w:tc>
+        <w:tc>
+          <w:tcPr>
+            <w:tcW w:w="3213" w:type="dxa"/>
+          </w:tcPr>
+          <w:p>
+            <w:pPr>
+              <w:spacing w:after="0"/>
+            </w:pPr>
+            <w:r>
+              <w:t xml:space="preserve">96–100</w:t>
+            </w:r>
+          </w:p>
+        </w:tc>
+        <w:tc>
+          <w:tcPr>
+            <w:tcW w:w="3212" w:type="dxa"/>
+          </w:tcPr>
+          <w:p>
+            <w:pPr>
+              <w:spacing w:after="0"/>
+            </w:pPr>
+            <w:r>
+              <w:t xml:space="preserve">5%</w:t>
+            </w:r>
+          </w:p>
+        </w:tc>
+      </w:tr>
+    </w:tbl>
+    <w:p>
+      <w:pPr>
+        <w:pStyle w:val="Heading2"/>
+        <w:spacing w:after="150" w:before="300"/>
+      </w:pPr>
+      <w:r>
+        <w:t xml:space="preserve">Humano</w:t>
+      </w:r>
+    </w:p>
+    <w:p>
+      <w:pPr>
+        <w:spacing w:after="150"/>
+      </w:pPr>
+      <w:r>
+        <w:t xml:space="preserve">Não tem Disciplinas. Limites de atributo na criação: Força, Destreza e Vitalidade até 3, Razão até 6. Vontade e Alma sem limite.</w:t>
+      </w:r>
+    </w:p>
+    <w:p>
+      <w:pPr>
+        <w:pStyle w:val="Heading2"/>
+        <w:spacing w:after="150" w:before="300"/>
+      </w:pPr>
+      <w:r>
+        <w:t xml:space="preserve">Vampiro</w:t>
+      </w:r>
+    </w:p>
+    <w:p>
+      <w:pPr>
+        <w:spacing w:after="150"/>
+      </w:pPr>
+      <w:r>
+        <w:t xml:space="preserve">Limites de atributo: Força, Destreza e Vitalidade até 5 (contra 3 do humano). Razão, Vontade e Alma seguem sem limite definido.</w:t>
+      </w:r>
+    </w:p>
+    <w:p>
+      <w:pPr>
+        <w:pStyle w:val="Heading2"/>
+        <w:spacing w:after="150" w:before="300"/>
+      </w:pPr>
+      <w:r>
+        <w:t>Fraquezas do Vampiro</w:t>
       </w:r>
     </w:p>
     <w:p>
@@ -3507,11 +3976,496 @@
     </w:p>
     <w:p>
       <w:pPr>
+        <w:pStyle w:val="Heading2"/>
+        <w:spacing w:after="150" w:before="300"/>
+      </w:pPr>
+      <w:r>
+        <w:t xml:space="preserve">Dhampir</w:t>
+      </w:r>
+    </w:p>
+    <w:p>
+      <w:pPr>
+        <w:spacing w:after="150"/>
+      </w:pPr>
+      <w:r>
+        <w:t xml:space="preserve">A junção de humano com vampiro. Alucard é um Dhampir. É um meio termo: perde algumas fraquezas do vampiro, mas nasce com menos poder sobrenatural. É uma raça forte e difícil de conseguir, e por isso rara.</w:t>
+      </w:r>
+    </w:p>
+    <w:p>
+      <w:pPr>
+        <w:spacing w:after="60" w:before="150"/>
+      </w:pPr>
+      <w:r>
+        <w:rPr>
+          <w:b/>
+          <w:bCs/>
+        </w:rPr>
+        <w:t xml:space="preserve">Disciplinas</w:t>
+      </w:r>
+    </w:p>
+    <w:p>
+      <w:pPr>
+        <w:spacing w:after="120"/>
+      </w:pPr>
+      <w:r>
+        <w:t xml:space="preserve">Começa com 3 pontos pra distribuir (o vampiro começa com 4). Com 3 pontos, o máximo possível na criação é o grau 3. Depois disso ganha pontos de Disciplina na mesma quantidade que o vampiro (ver Disciplinas).</w:t>
+      </w:r>
+    </w:p>
+    <w:p>
+      <w:pPr>
+        <w:spacing w:after="60" w:before="150"/>
+      </w:pPr>
+      <w:r>
+        <w:rPr>
+          <w:b/>
+          <w:bCs/>
+        </w:rPr>
+        <w:t xml:space="preserve">Fraquezas que não tem</w:t>
+      </w:r>
+    </w:p>
+    <w:p>
+      <w:pPr>
+        <w:spacing w:after="120"/>
+      </w:pPr>
+      <w:r>
+        <w:t xml:space="preserve">Sol e Fome.</w:t>
+      </w:r>
+    </w:p>
+    <w:p>
+      <w:pPr>
+        <w:spacing w:after="60" w:before="150"/>
+      </w:pPr>
+      <w:r>
+        <w:rPr>
+          <w:b/>
+          <w:bCs/>
+        </w:rPr>
+        <w:t xml:space="preserve">Fraquezas que mantém</w:t>
+      </w:r>
+    </w:p>
+    <w:p>
+      <w:pPr>
+        <w:spacing w:after="120"/>
+      </w:pPr>
+      <w:r>
+        <w:t xml:space="preserve">Prata, Estaca, Decapitação, Armas Sagradas e Água Sagrada. Algumas são mais fracas nele do que no vampiro; quanto exatamente, os mestres decidem depois (ver Em Aberto).</w:t>
+      </w:r>
+    </w:p>
+    <w:p>
+      <w:pPr>
+        <w:spacing w:after="60" w:before="150"/>
+      </w:pPr>
+      <w:r>
+        <w:rPr>
+          <w:b/>
+          <w:bCs/>
+        </w:rPr>
+        <w:t xml:space="preserve">Limites de atributo</w:t>
+      </w:r>
+    </w:p>
+    <w:p>
+      <w:pPr>
+        <w:spacing w:after="120"/>
+      </w:pPr>
+      <w:r>
+        <w:t xml:space="preserve">Ainda não definidos (ver Em Aberto).</w:t>
+      </w:r>
+    </w:p>
+    <w:p>
+      <w:pPr>
         <w:pStyle w:val="Heading1"/>
         <w:spacing w:after="200" w:before="400"/>
       </w:pPr>
       <w:r>
-        <w:t xml:space="preserve">11. Classes</w:t>
+        <w:t xml:space="preserve">12. Classe Social</w:t>
+      </w:r>
+    </w:p>
+    <w:p>
+      <w:pPr>
+        <w:spacing w:after="150"/>
+      </w:pPr>
+      <w:r>
+        <w:t xml:space="preserve">Rolada em 1d100 na criação, uma vez só por personagem. Representa o Estado em que o personagem nasceu, entre os três estados da sociedade francesa da época. No bot, o /classe_social faz o sorteio e registra o Estado.</w:t>
+      </w:r>
+    </w:p>
+    <w:tbl>
+      <w:tblPr>
+        <w:tblW w:w="9638" w:type="dxa"/>
+        <w:tblBorders>
+          <w:top w:val="single" w:sz="4" w:space="0" w:color="auto"/>
+          <w:left w:val="single" w:sz="4" w:space="0" w:color="auto"/>
+          <w:bottom w:val="single" w:sz="4" w:space="0" w:color="auto"/>
+          <w:right w:val="single" w:sz="4" w:space="0" w:color="auto"/>
+          <w:insideH w:val="single" w:sz="4" w:space="0" w:color="auto"/>
+          <w:insideV w:val="single" w:sz="4" w:space="0" w:color="auto"/>
+        </w:tblBorders>
+        <w:tblLayout w:type="fixed"/>
+      </w:tblPr>
+      <w:tblGrid>
+        <w:gridCol w:w="5354"/>
+        <w:gridCol w:w="2142"/>
+        <w:gridCol w:w="2142"/>
+      </w:tblGrid>
+      <w:tr>
+        <w:tc>
+          <w:tcPr>
+            <w:tcW w:w="5354" w:type="dxa"/>
+          </w:tcPr>
+          <w:p>
+            <w:pPr>
+              <w:spacing w:after="0"/>
+            </w:pPr>
+            <w:r>
+              <w:rPr>
+                <w:b/>
+                <w:bCs/>
+              </w:rPr>
+              <w:t xml:space="preserve">Resultado</w:t>
+            </w:r>
+          </w:p>
+        </w:tc>
+        <w:tc>
+          <w:tcPr>
+            <w:tcW w:w="2142" w:type="dxa"/>
+          </w:tcPr>
+          <w:p>
+            <w:pPr>
+              <w:spacing w:after="0"/>
+            </w:pPr>
+            <w:r>
+              <w:rPr>
+                <w:b/>
+                <w:bCs/>
+              </w:rPr>
+              <w:t xml:space="preserve">Resultado no 1d100</w:t>
+            </w:r>
+          </w:p>
+        </w:tc>
+        <w:tc>
+          <w:tcPr>
+            <w:tcW w:w="2142" w:type="dxa"/>
+          </w:tcPr>
+          <w:p>
+            <w:pPr>
+              <w:spacing w:after="0"/>
+            </w:pPr>
+            <w:r>
+              <w:rPr>
+                <w:b/>
+                <w:bCs/>
+              </w:rPr>
+              <w:t xml:space="preserve">Chance</w:t>
+            </w:r>
+          </w:p>
+        </w:tc>
+      </w:tr>
+      <w:tr>
+        <w:tc>
+          <w:tcPr>
+            <w:tcW w:w="5354" w:type="dxa"/>
+          </w:tcPr>
+          <w:p>
+            <w:pPr>
+              <w:spacing w:after="0"/>
+            </w:pPr>
+            <w:r>
+              <w:t xml:space="preserve">3º Estado (Povo: camponeses e sans-culottes)</w:t>
+            </w:r>
+          </w:p>
+        </w:tc>
+        <w:tc>
+          <w:tcPr>
+            <w:tcW w:w="2142" w:type="dxa"/>
+          </w:tcPr>
+          <w:p>
+            <w:pPr>
+              <w:spacing w:after="0"/>
+            </w:pPr>
+            <w:r>
+              <w:t xml:space="preserve">1–80</w:t>
+            </w:r>
+          </w:p>
+        </w:tc>
+        <w:tc>
+          <w:tcPr>
+            <w:tcW w:w="2142" w:type="dxa"/>
+          </w:tcPr>
+          <w:p>
+            <w:pPr>
+              <w:spacing w:after="0"/>
+            </w:pPr>
+            <w:r>
+              <w:t xml:space="preserve">80%</w:t>
+            </w:r>
+          </w:p>
+        </w:tc>
+      </w:tr>
+      <w:tr>
+        <w:tc>
+          <w:tcPr>
+            <w:tcW w:w="5354" w:type="dxa"/>
+          </w:tcPr>
+          <w:p>
+            <w:pPr>
+              <w:spacing w:after="0"/>
+            </w:pPr>
+            <w:r>
+              <w:t xml:space="preserve">2º Estado (Nobreza)</w:t>
+            </w:r>
+          </w:p>
+        </w:tc>
+        <w:tc>
+          <w:tcPr>
+            <w:tcW w:w="2142" w:type="dxa"/>
+          </w:tcPr>
+          <w:p>
+            <w:pPr>
+              <w:spacing w:after="0"/>
+            </w:pPr>
+            <w:r>
+              <w:t xml:space="preserve">81–91</w:t>
+            </w:r>
+          </w:p>
+        </w:tc>
+        <w:tc>
+          <w:tcPr>
+            <w:tcW w:w="2142" w:type="dxa"/>
+          </w:tcPr>
+          <w:p>
+            <w:pPr>
+              <w:spacing w:after="0"/>
+            </w:pPr>
+            <w:r>
+              <w:t xml:space="preserve">11%</w:t>
+            </w:r>
+          </w:p>
+        </w:tc>
+      </w:tr>
+      <w:tr>
+        <w:tc>
+          <w:tcPr>
+            <w:tcW w:w="5354" w:type="dxa"/>
+          </w:tcPr>
+          <w:p>
+            <w:pPr>
+              <w:spacing w:after="0"/>
+            </w:pPr>
+            <w:r>
+              <w:t xml:space="preserve">1º Estado (Clero)</w:t>
+            </w:r>
+          </w:p>
+        </w:tc>
+        <w:tc>
+          <w:tcPr>
+            <w:tcW w:w="2142" w:type="dxa"/>
+          </w:tcPr>
+          <w:p>
+            <w:pPr>
+              <w:spacing w:after="0"/>
+            </w:pPr>
+            <w:r>
+              <w:t xml:space="preserve">92–99</w:t>
+            </w:r>
+          </w:p>
+        </w:tc>
+        <w:tc>
+          <w:tcPr>
+            <w:tcW w:w="2142" w:type="dxa"/>
+          </w:tcPr>
+          <w:p>
+            <w:pPr>
+              <w:spacing w:after="0"/>
+            </w:pPr>
+            <w:r>
+              <w:t xml:space="preserve">8%</w:t>
+            </w:r>
+          </w:p>
+        </w:tc>
+      </w:tr>
+      <w:tr>
+        <w:tc>
+          <w:tcPr>
+            <w:tcW w:w="5354" w:type="dxa"/>
+          </w:tcPr>
+          <w:p>
+            <w:pPr>
+              <w:spacing w:after="0"/>
+            </w:pPr>
+            <w:r>
+              <w:t xml:space="preserve">O mestre decide o Estado</w:t>
+            </w:r>
+          </w:p>
+        </w:tc>
+        <w:tc>
+          <w:tcPr>
+            <w:tcW w:w="2142" w:type="dxa"/>
+          </w:tcPr>
+          <w:p>
+            <w:pPr>
+              <w:spacing w:after="0"/>
+            </w:pPr>
+            <w:r>
+              <w:t xml:space="preserve">100</w:t>
+            </w:r>
+          </w:p>
+        </w:tc>
+        <w:tc>
+          <w:tcPr>
+            <w:tcW w:w="2142" w:type="dxa"/>
+          </w:tcPr>
+          <w:p>
+            <w:pPr>
+              <w:spacing w:after="0"/>
+            </w:pPr>
+            <w:r>
+              <w:t xml:space="preserve">1%</w:t>
+            </w:r>
+          </w:p>
+        </w:tc>
+      </w:tr>
+    </w:tbl>
+    <w:p>
+      <w:pPr>
+        <w:pStyle w:val="Heading2"/>
+        <w:spacing w:after="150" w:before="300"/>
+      </w:pPr>
+      <w:r>
+        <w:t xml:space="preserve">Clero</w:t>
+      </w:r>
+    </w:p>
+    <w:p>
+      <w:pPr>
+        <w:spacing w:after="150"/>
+      </w:pPr>
+      <w:r>
+        <w:t xml:space="preserve">Quem cai no 1º Estado rola outro 1d100 na hora.</w:t>
+      </w:r>
+    </w:p>
+    <w:tbl>
+      <w:tblPr>
+        <w:tblW w:w="9638" w:type="dxa"/>
+        <w:tblBorders>
+          <w:top w:val="single" w:sz="4" w:space="0" w:color="auto"/>
+          <w:left w:val="single" w:sz="4" w:space="0" w:color="auto"/>
+          <w:bottom w:val="single" w:sz="4" w:space="0" w:color="auto"/>
+          <w:right w:val="single" w:sz="4" w:space="0" w:color="auto"/>
+          <w:insideH w:val="single" w:sz="4" w:space="0" w:color="auto"/>
+          <w:insideV w:val="single" w:sz="4" w:space="0" w:color="auto"/>
+        </w:tblBorders>
+        <w:tblLayout w:type="fixed"/>
+      </w:tblPr>
+      <w:tblGrid>
+        <w:gridCol w:w="4819"/>
+        <w:gridCol w:w="4819"/>
+      </w:tblGrid>
+      <w:tr>
+        <w:tc>
+          <w:tcPr>
+            <w:tcW w:w="4819" w:type="dxa"/>
+          </w:tcPr>
+          <w:p>
+            <w:pPr>
+              <w:spacing w:after="0"/>
+            </w:pPr>
+            <w:r>
+              <w:rPr>
+                <w:b/>
+                <w:bCs/>
+              </w:rPr>
+              <w:t xml:space="preserve">Segundo 1d100</w:t>
+            </w:r>
+          </w:p>
+        </w:tc>
+        <w:tc>
+          <w:tcPr>
+            <w:tcW w:w="4819" w:type="dxa"/>
+          </w:tcPr>
+          <w:p>
+            <w:pPr>
+              <w:spacing w:after="0"/>
+            </w:pPr>
+            <w:r>
+              <w:rPr>
+                <w:b/>
+                <w:bCs/>
+              </w:rPr>
+              <w:t xml:space="preserve">Resultado</w:t>
+            </w:r>
+          </w:p>
+        </w:tc>
+      </w:tr>
+      <w:tr>
+        <w:tc>
+          <w:tcPr>
+            <w:tcW w:w="4819" w:type="dxa"/>
+          </w:tcPr>
+          <w:p>
+            <w:pPr>
+              <w:spacing w:after="0"/>
+            </w:pPr>
+            <w:r>
+              <w:t xml:space="preserve">1–49</w:t>
+            </w:r>
+          </w:p>
+        </w:tc>
+        <w:tc>
+          <w:tcPr>
+            <w:tcW w:w="4819" w:type="dxa"/>
+          </w:tcPr>
+          <w:p>
+            <w:pPr>
+              <w:spacing w:after="0"/>
+            </w:pPr>
+            <w:r>
+              <w:t xml:space="preserve">Baixo Clero</w:t>
+            </w:r>
+          </w:p>
+        </w:tc>
+      </w:tr>
+      <w:tr>
+        <w:tc>
+          <w:tcPr>
+            <w:tcW w:w="4819" w:type="dxa"/>
+          </w:tcPr>
+          <w:p>
+            <w:pPr>
+              <w:spacing w:after="0"/>
+            </w:pPr>
+            <w:r>
+              <w:t xml:space="preserve">50–100</w:t>
+            </w:r>
+          </w:p>
+        </w:tc>
+        <w:tc>
+          <w:tcPr>
+            <w:tcW w:w="4819" w:type="dxa"/>
+          </w:tcPr>
+          <w:p>
+            <w:pPr>
+              <w:spacing w:after="0"/>
+            </w:pPr>
+            <w:r>
+              <w:t xml:space="preserve">Alto Clero</w:t>
+            </w:r>
+          </w:p>
+        </w:tc>
+      </w:tr>
+    </w:tbl>
+    <w:p>
+      <w:pPr>
+        <w:spacing w:after="150" w:before="120"/>
+      </w:pPr>
+      <w:r>
+        <w:t xml:space="preserve">A Magia Divina é exclusiva de clero e nobreza com Fé suficiente (ver Sistema de Magia). As vantagens e restrições de cada Estado, e de Alto e Baixo Clero, ainda não foram definidas (ver Em Aberto).</w:t>
+      </w:r>
+    </w:p>
+    <w:p>
+      <w:pPr>
+        <w:pStyle w:val="Heading1"/>
+        <w:spacing w:after="200" w:before="400"/>
+      </w:pPr>
+      <w:r>
+        <w:t>13. Classes</w:t>
       </w:r>
     </w:p>
     <w:p>
@@ -3784,7 +4738,7 @@
         <w:spacing w:after="200" w:before="400"/>
       </w:pPr>
       <w:r>
-        <w:t xml:space="preserve">12. Habilidades Iniciais</w:t>
+        <w:t>14. Habilidades Iniciais</w:t>
       </w:r>
     </w:p>
     <w:p>
@@ -3861,7 +4815,7 @@
         <w:spacing w:after="200" w:before="400"/>
       </w:pPr>
       <w:r>
-        <w:t xml:space="preserve">13. Progressão de Personagem</w:t>
+        <w:t>15. Progressão de Personagem</w:t>
       </w:r>
     </w:p>
     <w:p>
@@ -3869,7 +4823,1701 @@
         <w:spacing w:after="150"/>
       </w:pPr>
       <w:r>
-        <w:t xml:space="preserve">Nível máximo: 10. Subir de nível não segue uma fórmula fixa de pontos ou cenas; é decisão dos mestres, concedida em três situações:</w:t>
+        <w:t xml:space="preserve">Nível máximo: 10. Todo personagem começa no nível 1, com 0 XP.</w:t>
+      </w:r>
+    </w:p>
+    <w:p>
+      <w:pPr>
+        <w:pStyle w:val="Heading2"/>
+        <w:spacing w:after="150" w:before="300"/>
+      </w:pPr>
+      <w:r>
+        <w:t xml:space="preserve">Ganhando XP</w:t>
+      </w:r>
+    </w:p>
+    <w:p>
+      <w:pPr>
+        <w:spacing w:after="150"/>
+      </w:pPr>
+      <w:r>
+        <w:t xml:space="preserve">Só os mestres dão XP. Ele vem de roleplay importante, de missão de mestre e do desenvolvimento do personagem, sempre por roleplay e não por ação avulsa. O nível sobe automaticamente quando o XP chega no número da tabela.</w:t>
+      </w:r>
+    </w:p>
+    <w:p>
+      <w:pPr>
+        <w:pStyle w:val="Heading2"/>
+        <w:spacing w:after="150" w:before="300"/>
+      </w:pPr>
+      <w:r>
+        <w:t xml:space="preserve">A conta</w:t>
+      </w:r>
+    </w:p>
+    <w:p>
+      <w:pPr>
+        <w:spacing w:after="150"/>
+      </w:pPr>
+      <w:r>
+        <w:rPr>
+          <w:b/>
+          <w:bCs/>
+        </w:rPr>
+        <w:t xml:space="preserve">XP pra sair do nível N = N × 1.000</w:t>
+      </w:r>
+    </w:p>
+    <w:p>
+      <w:pPr>
+        <w:spacing w:after="150"/>
+      </w:pPr>
+      <w:r>
+        <w:t xml:space="preserve">O XP é somado, não zera a cada nível: 1.000 XP pra sair do nível 1, mais 2.000 pra sair do 2, mais 3.000 pra sair do 3, e assim por diante. O XP que passa do necessário vale pro nível seguinte, e dá pra subir mais de um nível de uma vez.</w:t>
+      </w:r>
+    </w:p>
+    <w:tbl>
+      <w:tblPr>
+        <w:tblW w:w="9638" w:type="dxa"/>
+        <w:tblBorders>
+          <w:top w:val="single" w:sz="4" w:space="0" w:color="auto"/>
+          <w:left w:val="single" w:sz="4" w:space="0" w:color="auto"/>
+          <w:bottom w:val="single" w:sz="4" w:space="0" w:color="auto"/>
+          <w:right w:val="single" w:sz="4" w:space="0" w:color="auto"/>
+          <w:insideH w:val="single" w:sz="4" w:space="0" w:color="auto"/>
+          <w:insideV w:val="single" w:sz="4" w:space="0" w:color="auto"/>
+        </w:tblBorders>
+        <w:tblLayout w:type="fixed"/>
+      </w:tblPr>
+      <w:tblGrid>
+        <w:gridCol w:w="1157"/>
+        <w:gridCol w:w="1638"/>
+        <w:gridCol w:w="4530"/>
+        <w:gridCol w:w="2313"/>
+      </w:tblGrid>
+      <w:tr>
+        <w:tc>
+          <w:tcPr>
+            <w:tcW w:w="1157" w:type="dxa"/>
+          </w:tcPr>
+          <w:p>
+            <w:pPr>
+              <w:spacing w:after="0"/>
+            </w:pPr>
+            <w:r>
+              <w:rPr>
+                <w:b/>
+                <w:bCs/>
+              </w:rPr>
+              <w:t xml:space="preserve">Nível</w:t>
+            </w:r>
+          </w:p>
+        </w:tc>
+        <w:tc>
+          <w:tcPr>
+            <w:tcW w:w="1638" w:type="dxa"/>
+          </w:tcPr>
+          <w:p>
+            <w:pPr>
+              <w:spacing w:after="0"/>
+            </w:pPr>
+            <w:r>
+              <w:rPr>
+                <w:b/>
+                <w:bCs/>
+              </w:rPr>
+              <w:t xml:space="preserve">XP total pra chegar</w:t>
+            </w:r>
+          </w:p>
+        </w:tc>
+        <w:tc>
+          <w:tcPr>
+            <w:tcW w:w="4530" w:type="dxa"/>
+          </w:tcPr>
+          <w:p>
+            <w:pPr>
+              <w:spacing w:after="0"/>
+            </w:pPr>
+            <w:r>
+              <w:rPr>
+                <w:b/>
+                <w:bCs/>
+              </w:rPr>
+              <w:t xml:space="preserve">Vantagens</w:t>
+            </w:r>
+          </w:p>
+        </w:tc>
+        <w:tc>
+          <w:tcPr>
+            <w:tcW w:w="2313" w:type="dxa"/>
+          </w:tcPr>
+          <w:p>
+            <w:pPr>
+              <w:spacing w:after="0"/>
+            </w:pPr>
+            <w:r>
+              <w:rPr>
+                <w:b/>
+                <w:bCs/>
+              </w:rPr>
+              <w:t xml:space="preserve">Pontos de Atributo no total</w:t>
+            </w:r>
+          </w:p>
+        </w:tc>
+      </w:tr>
+      <w:tr>
+        <w:tc>
+          <w:tcPr>
+            <w:tcW w:w="1157" w:type="dxa"/>
+          </w:tcPr>
+          <w:p>
+            <w:pPr>
+              <w:spacing w:after="0"/>
+            </w:pPr>
+            <w:r>
+              <w:t xml:space="preserve">1</w:t>
+            </w:r>
+          </w:p>
+        </w:tc>
+        <w:tc>
+          <w:tcPr>
+            <w:tcW w:w="1638" w:type="dxa"/>
+          </w:tcPr>
+          <w:p>
+            <w:pPr>
+              <w:spacing w:after="0"/>
+            </w:pPr>
+            <w:r>
+              <w:t xml:space="preserve">0</w:t>
+            </w:r>
+          </w:p>
+        </w:tc>
+        <w:tc>
+          <w:tcPr>
+            <w:tcW w:w="4530" w:type="dxa"/>
+          </w:tcPr>
+          <w:p>
+            <w:pPr>
+              <w:spacing w:after="0"/>
+            </w:pPr>
+            <w:r>
+              <w:t xml:space="preserve">Ficha inicial, feita na criação</w:t>
+            </w:r>
+          </w:p>
+        </w:tc>
+        <w:tc>
+          <w:tcPr>
+            <w:tcW w:w="2313" w:type="dxa"/>
+          </w:tcPr>
+          <w:p>
+            <w:pPr>
+              <w:spacing w:after="0"/>
+            </w:pPr>
+            <w:r>
+              <w:t xml:space="preserve">6</w:t>
+            </w:r>
+          </w:p>
+        </w:tc>
+      </w:tr>
+      <w:tr>
+        <w:tc>
+          <w:tcPr>
+            <w:tcW w:w="1157" w:type="dxa"/>
+          </w:tcPr>
+          <w:p>
+            <w:pPr>
+              <w:spacing w:after="0"/>
+            </w:pPr>
+            <w:r>
+              <w:t xml:space="preserve">2</w:t>
+            </w:r>
+          </w:p>
+        </w:tc>
+        <w:tc>
+          <w:tcPr>
+            <w:tcW w:w="1638" w:type="dxa"/>
+          </w:tcPr>
+          <w:p>
+            <w:pPr>
+              <w:spacing w:after="0"/>
+            </w:pPr>
+            <w:r>
+              <w:t xml:space="preserve">1.000</w:t>
+            </w:r>
+          </w:p>
+        </w:tc>
+        <w:tc>
+          <w:tcPr>
+            <w:tcW w:w="4530" w:type="dxa"/>
+          </w:tcPr>
+          <w:p>
+            <w:pPr>
+              <w:spacing w:after="0"/>
+            </w:pPr>
+            <w:r>
+              <w:t xml:space="preserve">+2 pontos de Perícia, +1 ponto de Atributo, habilidade nova ou melhorada</w:t>
+            </w:r>
+          </w:p>
+        </w:tc>
+        <w:tc>
+          <w:tcPr>
+            <w:tcW w:w="2313" w:type="dxa"/>
+          </w:tcPr>
+          <w:p>
+            <w:pPr>
+              <w:spacing w:after="0"/>
+            </w:pPr>
+            <w:r>
+              <w:t xml:space="preserve">7</w:t>
+            </w:r>
+          </w:p>
+        </w:tc>
+      </w:tr>
+      <w:tr>
+        <w:tc>
+          <w:tcPr>
+            <w:tcW w:w="1157" w:type="dxa"/>
+          </w:tcPr>
+          <w:p>
+            <w:pPr>
+              <w:spacing w:after="0"/>
+            </w:pPr>
+            <w:r>
+              <w:t xml:space="preserve">3</w:t>
+            </w:r>
+          </w:p>
+        </w:tc>
+        <w:tc>
+          <w:tcPr>
+            <w:tcW w:w="1638" w:type="dxa"/>
+          </w:tcPr>
+          <w:p>
+            <w:pPr>
+              <w:spacing w:after="0"/>
+            </w:pPr>
+            <w:r>
+              <w:t xml:space="preserve">3.000</w:t>
+            </w:r>
+          </w:p>
+        </w:tc>
+        <w:tc>
+          <w:tcPr>
+            <w:tcW w:w="4530" w:type="dxa"/>
+          </w:tcPr>
+          <w:p>
+            <w:pPr>
+              <w:spacing w:after="0"/>
+            </w:pPr>
+            <w:r>
+              <w:t xml:space="preserve">+2 pontos de Perícia</w:t>
+            </w:r>
+          </w:p>
+        </w:tc>
+        <w:tc>
+          <w:tcPr>
+            <w:tcW w:w="2313" w:type="dxa"/>
+          </w:tcPr>
+          <w:p>
+            <w:pPr>
+              <w:spacing w:after="0"/>
+            </w:pPr>
+            <w:r>
+              <w:t xml:space="preserve">7</w:t>
+            </w:r>
+          </w:p>
+        </w:tc>
+      </w:tr>
+      <w:tr>
+        <w:tc>
+          <w:tcPr>
+            <w:tcW w:w="1157" w:type="dxa"/>
+          </w:tcPr>
+          <w:p>
+            <w:pPr>
+              <w:spacing w:after="0"/>
+            </w:pPr>
+            <w:r>
+              <w:t xml:space="preserve">4</w:t>
+            </w:r>
+          </w:p>
+        </w:tc>
+        <w:tc>
+          <w:tcPr>
+            <w:tcW w:w="1638" w:type="dxa"/>
+          </w:tcPr>
+          <w:p>
+            <w:pPr>
+              <w:spacing w:after="0"/>
+            </w:pPr>
+            <w:r>
+              <w:t xml:space="preserve">6.000</w:t>
+            </w:r>
+          </w:p>
+        </w:tc>
+        <w:tc>
+          <w:tcPr>
+            <w:tcW w:w="4530" w:type="dxa"/>
+          </w:tcPr>
+          <w:p>
+            <w:pPr>
+              <w:spacing w:after="0"/>
+            </w:pPr>
+            <w:r>
+              <w:t xml:space="preserve">+2 pontos de Perícia, +1 ponto de Atributo, habilidade nova ou melhorada</w:t>
+            </w:r>
+          </w:p>
+        </w:tc>
+        <w:tc>
+          <w:tcPr>
+            <w:tcW w:w="2313" w:type="dxa"/>
+          </w:tcPr>
+          <w:p>
+            <w:pPr>
+              <w:spacing w:after="0"/>
+            </w:pPr>
+            <w:r>
+              <w:t xml:space="preserve">8</w:t>
+            </w:r>
+          </w:p>
+        </w:tc>
+      </w:tr>
+      <w:tr>
+        <w:tc>
+          <w:tcPr>
+            <w:tcW w:w="1157" w:type="dxa"/>
+          </w:tcPr>
+          <w:p>
+            <w:pPr>
+              <w:spacing w:after="0"/>
+            </w:pPr>
+            <w:r>
+              <w:t xml:space="preserve">5</w:t>
+            </w:r>
+          </w:p>
+        </w:tc>
+        <w:tc>
+          <w:tcPr>
+            <w:tcW w:w="1638" w:type="dxa"/>
+          </w:tcPr>
+          <w:p>
+            <w:pPr>
+              <w:spacing w:after="0"/>
+            </w:pPr>
+            <w:r>
+              <w:t xml:space="preserve">10.000</w:t>
+            </w:r>
+          </w:p>
+        </w:tc>
+        <w:tc>
+          <w:tcPr>
+            <w:tcW w:w="4530" w:type="dxa"/>
+          </w:tcPr>
+          <w:p>
+            <w:pPr>
+              <w:spacing w:after="0"/>
+            </w:pPr>
+            <w:r>
+              <w:t xml:space="preserve">+2 pontos de Perícia</w:t>
+            </w:r>
+          </w:p>
+        </w:tc>
+        <w:tc>
+          <w:tcPr>
+            <w:tcW w:w="2313" w:type="dxa"/>
+          </w:tcPr>
+          <w:p>
+            <w:pPr>
+              <w:spacing w:after="0"/>
+            </w:pPr>
+            <w:r>
+              <w:t xml:space="preserve">8</w:t>
+            </w:r>
+          </w:p>
+        </w:tc>
+      </w:tr>
+      <w:tr>
+        <w:tc>
+          <w:tcPr>
+            <w:tcW w:w="1157" w:type="dxa"/>
+          </w:tcPr>
+          <w:p>
+            <w:pPr>
+              <w:spacing w:after="0"/>
+            </w:pPr>
+            <w:r>
+              <w:t xml:space="preserve">6</w:t>
+            </w:r>
+          </w:p>
+        </w:tc>
+        <w:tc>
+          <w:tcPr>
+            <w:tcW w:w="1638" w:type="dxa"/>
+          </w:tcPr>
+          <w:p>
+            <w:pPr>
+              <w:spacing w:after="0"/>
+            </w:pPr>
+            <w:r>
+              <w:t xml:space="preserve">15.000</w:t>
+            </w:r>
+          </w:p>
+        </w:tc>
+        <w:tc>
+          <w:tcPr>
+            <w:tcW w:w="4530" w:type="dxa"/>
+          </w:tcPr>
+          <w:p>
+            <w:pPr>
+              <w:spacing w:after="0"/>
+            </w:pPr>
+            <w:r>
+              <w:t xml:space="preserve">+2 pontos de Perícia, +1 ponto de Atributo, habilidade nova ou melhorada</w:t>
+            </w:r>
+          </w:p>
+        </w:tc>
+        <w:tc>
+          <w:tcPr>
+            <w:tcW w:w="2313" w:type="dxa"/>
+          </w:tcPr>
+          <w:p>
+            <w:pPr>
+              <w:spacing w:after="0"/>
+            </w:pPr>
+            <w:r>
+              <w:t xml:space="preserve">9</w:t>
+            </w:r>
+          </w:p>
+        </w:tc>
+      </w:tr>
+      <w:tr>
+        <w:tc>
+          <w:tcPr>
+            <w:tcW w:w="1157" w:type="dxa"/>
+          </w:tcPr>
+          <w:p>
+            <w:pPr>
+              <w:spacing w:after="0"/>
+            </w:pPr>
+            <w:r>
+              <w:t xml:space="preserve">7</w:t>
+            </w:r>
+          </w:p>
+        </w:tc>
+        <w:tc>
+          <w:tcPr>
+            <w:tcW w:w="1638" w:type="dxa"/>
+          </w:tcPr>
+          <w:p>
+            <w:pPr>
+              <w:spacing w:after="0"/>
+            </w:pPr>
+            <w:r>
+              <w:t xml:space="preserve">21.000</w:t>
+            </w:r>
+          </w:p>
+        </w:tc>
+        <w:tc>
+          <w:tcPr>
+            <w:tcW w:w="4530" w:type="dxa"/>
+          </w:tcPr>
+          <w:p>
+            <w:pPr>
+              <w:spacing w:after="0"/>
+            </w:pPr>
+            <w:r>
+              <w:t xml:space="preserve">+2 pontos de Perícia</w:t>
+            </w:r>
+          </w:p>
+        </w:tc>
+        <w:tc>
+          <w:tcPr>
+            <w:tcW w:w="2313" w:type="dxa"/>
+          </w:tcPr>
+          <w:p>
+            <w:pPr>
+              <w:spacing w:after="0"/>
+            </w:pPr>
+            <w:r>
+              <w:t xml:space="preserve">9</w:t>
+            </w:r>
+          </w:p>
+        </w:tc>
+      </w:tr>
+      <w:tr>
+        <w:tc>
+          <w:tcPr>
+            <w:tcW w:w="1157" w:type="dxa"/>
+          </w:tcPr>
+          <w:p>
+            <w:pPr>
+              <w:spacing w:after="0"/>
+            </w:pPr>
+            <w:r>
+              <w:t xml:space="preserve">8</w:t>
+            </w:r>
+          </w:p>
+        </w:tc>
+        <w:tc>
+          <w:tcPr>
+            <w:tcW w:w="1638" w:type="dxa"/>
+          </w:tcPr>
+          <w:p>
+            <w:pPr>
+              <w:spacing w:after="0"/>
+            </w:pPr>
+            <w:r>
+              <w:t xml:space="preserve">28.000</w:t>
+            </w:r>
+          </w:p>
+        </w:tc>
+        <w:tc>
+          <w:tcPr>
+            <w:tcW w:w="4530" w:type="dxa"/>
+          </w:tcPr>
+          <w:p>
+            <w:pPr>
+              <w:spacing w:after="0"/>
+            </w:pPr>
+            <w:r>
+              <w:t xml:space="preserve">+2 pontos de Perícia, +1 ponto de Atributo, habilidade nova ou melhorada</w:t>
+            </w:r>
+          </w:p>
+        </w:tc>
+        <w:tc>
+          <w:tcPr>
+            <w:tcW w:w="2313" w:type="dxa"/>
+          </w:tcPr>
+          <w:p>
+            <w:pPr>
+              <w:spacing w:after="0"/>
+            </w:pPr>
+            <w:r>
+              <w:t xml:space="preserve">10</w:t>
+            </w:r>
+          </w:p>
+        </w:tc>
+      </w:tr>
+      <w:tr>
+        <w:tc>
+          <w:tcPr>
+            <w:tcW w:w="1157" w:type="dxa"/>
+          </w:tcPr>
+          <w:p>
+            <w:pPr>
+              <w:spacing w:after="0"/>
+            </w:pPr>
+            <w:r>
+              <w:t xml:space="preserve">9</w:t>
+            </w:r>
+          </w:p>
+        </w:tc>
+        <w:tc>
+          <w:tcPr>
+            <w:tcW w:w="1638" w:type="dxa"/>
+          </w:tcPr>
+          <w:p>
+            <w:pPr>
+              <w:spacing w:after="0"/>
+            </w:pPr>
+            <w:r>
+              <w:t xml:space="preserve">36.000</w:t>
+            </w:r>
+          </w:p>
+        </w:tc>
+        <w:tc>
+          <w:tcPr>
+            <w:tcW w:w="4530" w:type="dxa"/>
+          </w:tcPr>
+          <w:p>
+            <w:pPr>
+              <w:spacing w:after="0"/>
+            </w:pPr>
+            <w:r>
+              <w:t xml:space="preserve">+2 pontos de Perícia</w:t>
+            </w:r>
+          </w:p>
+        </w:tc>
+        <w:tc>
+          <w:tcPr>
+            <w:tcW w:w="2313" w:type="dxa"/>
+          </w:tcPr>
+          <w:p>
+            <w:pPr>
+              <w:spacing w:after="0"/>
+            </w:pPr>
+            <w:r>
+              <w:t xml:space="preserve">10</w:t>
+            </w:r>
+          </w:p>
+        </w:tc>
+      </w:tr>
+      <w:tr>
+        <w:tc>
+          <w:tcPr>
+            <w:tcW w:w="1157" w:type="dxa"/>
+          </w:tcPr>
+          <w:p>
+            <w:pPr>
+              <w:spacing w:after="0"/>
+            </w:pPr>
+            <w:r>
+              <w:t xml:space="preserve">10 (máximo)</w:t>
+            </w:r>
+          </w:p>
+        </w:tc>
+        <w:tc>
+          <w:tcPr>
+            <w:tcW w:w="1638" w:type="dxa"/>
+          </w:tcPr>
+          <w:p>
+            <w:pPr>
+              <w:spacing w:after="0"/>
+            </w:pPr>
+            <w:r>
+              <w:t xml:space="preserve">45.000</w:t>
+            </w:r>
+          </w:p>
+        </w:tc>
+        <w:tc>
+          <w:tcPr>
+            <w:tcW w:w="4530" w:type="dxa"/>
+          </w:tcPr>
+          <w:p>
+            <w:pPr>
+              <w:spacing w:after="0"/>
+            </w:pPr>
+            <w:r>
+              <w:t xml:space="preserve">+2 pontos de Perícia, +1 ponto de Atributo, habilidade nova ou melhorada</w:t>
+            </w:r>
+          </w:p>
+        </w:tc>
+        <w:tc>
+          <w:tcPr>
+            <w:tcW w:w="2313" w:type="dxa"/>
+          </w:tcPr>
+          <w:p>
+            <w:pPr>
+              <w:spacing w:after="0"/>
+            </w:pPr>
+            <w:r>
+              <w:t xml:space="preserve">11</w:t>
+            </w:r>
+          </w:p>
+        </w:tc>
+      </w:tr>
+    </w:tbl>
+    <w:p>
+      <w:pPr>
+        <w:spacing w:after="150" w:before="120"/>
+      </w:pPr>
+      <w:r>
+        <w:rPr>
+          <w:b/>
+          <w:bCs/>
+        </w:rPr>
+        <w:t xml:space="preserve">Disciplina: </w:t>
+      </w:r>
+      <w:r>
+        <w:t xml:space="preserve">vampiros e dhampirs ganham, além disso, +1 ponto de Disciplina nos níveis pares (2, 4, 6, 8 e 10).</w:t>
+      </w:r>
+    </w:p>
+    <w:p>
+      <w:pPr>
+        <w:spacing w:after="150"/>
+      </w:pPr>
+      <w:r>
+        <w:t xml:space="preserve">Somando tudo do nível 1 ao 10: 18 pontos de Perícia, 5 pontos de Atributo e 5 habilidades novas ou melhoradas (mais 5 pontos de Disciplina pra vampiros e dhampirs). A coluna “Pontos de Atributo no total” soma os 6 pontos da criação com os que vêm de nível, e é a conta que o bot usa pra conferir a distribuição. Depois do nível 10 o XP continua contando, mas não sobe mais nível.</w:t>
+      </w:r>
+    </w:p>
+    <w:p>
+      <w:pPr>
+        <w:spacing w:after="150"/>
+      </w:pPr>
+      <w:r>
+        <w:t xml:space="preserve">Nos níveis pares o personagem escolhe entre criar uma habilidade nova, seguindo a mesma lógica da Habilidade Própria inicial, ou melhorar uma habilidade que já tem.</w:t>
+      </w:r>
+    </w:p>
+    <w:p>
+      <w:pPr>
+        <w:spacing w:after="150"/>
+      </w:pPr>
+      <w:r>
+        <w:t xml:space="preserve">Atributo sobe mais devagar de propósito: a progressão é pensada pra manter os personagens relativamente fracos ao longo do tempo, não pra virarem lendas em poucas sessões.</w:t>
+      </w:r>
+    </w:p>
+    <w:p>
+      <w:pPr>
+        <w:spacing w:after="150"/>
+      </w:pPr>
+      <w:r>
+        <w:t xml:space="preserve">Pontos de Atributo ganhos por nível podem ultrapassar o limite de criação (3 pro humano, 5 pro vampiro). Isso representa o personagem crescendo além do que é natural pra sua raça através da experiência, e não um erro de ficha.</w:t>
+      </w:r>
+    </w:p>
+    <w:p>
+      <w:pPr>
+        <w:spacing w:after="150"/>
+      </w:pPr>
+      <w:r>
+        <w:t xml:space="preserve">O nível não dá Vida direto: a Vida sobe quando os pontos de atributo vão pra Vitalidade (cada ponto vale +5 Vida e +3 Estamina).</w:t>
+      </w:r>
+    </w:p>
+    <w:p>
+      <w:pPr>
+        <w:pStyle w:val="Heading1"/>
+        <w:spacing w:after="200" w:before="400"/>
+      </w:pPr>
+      <w:r>
+        <w:t xml:space="preserve">16. Bot de Discord</w:t>
+      </w:r>
+    </w:p>
+    <w:p>
+      <w:pPr>
+        <w:spacing w:after="150"/>
+      </w:pPr>
+      <w:r>
+        <w:t xml:space="preserve">O bot do servidor rola dados, guarda o histórico e mantém a ficha automática de cada personagem.</w:t>
+      </w:r>
+    </w:p>
+    <w:p>
+      <w:pPr>
+        <w:pStyle w:val="Heading2"/>
+        <w:spacing w:after="150" w:before="300"/>
+      </w:pPr>
+      <w:r>
+        <w:t xml:space="preserve">Pra começar</w:t>
+      </w:r>
+    </w:p>
+    <w:p>
+      <w:pPr>
+        <w:spacing w:after="150"/>
+      </w:pPr>
+      <w:r>
+        <w:t xml:space="preserve">Nessa ordem: /personagem criar, /magia_inicial, /raca_inicial, /classe_social, /classe, /atributos e /minha_ficha. Cada sorteio vale uma vez só por personagem, e o resultado aparece pra todo mundo. A classe também vale uma vez só. Se der erro, um mestre corrige.</w:t>
+      </w:r>
+    </w:p>
+    <w:p>
+      <w:pPr>
+        <w:pStyle w:val="Heading2"/>
+        <w:spacing w:after="150" w:before="300"/>
+      </w:pPr>
+      <w:r>
+        <w:t xml:space="preserve">Atributos no bot</w:t>
+      </w:r>
+    </w:p>
+    <w:p>
+      <w:pPr>
+        <w:spacing w:after="150"/>
+      </w:pPr>
+      <w:r>
+        <w:t xml:space="preserve">O jogador distribui os pontos com /atributos (só preenche o que quer mudar) e só pode aumentar; pra diminuir, precisa de um mestre. O bot confere duas coisas: o total de pontos (6 na criação mais 1 a cada 2 níveis) e os limites de criação da raça (Humano: 3 em Força, Destreza e Vitalidade e 6 em Razão; Vampiro: 5 em Força, Destreza e Vitalidade; Vontade e Alma sem limite). Só os pontos que vêm de nível podem passar dos limites de criação, como explica o capítulo Progressão de Personagem. Pro Dhampir, como os limites ainda não foram definidos, o bot só confere o total. O jogador precisa ter sorteado a raça antes. Os mestres podem definir atributos na mão, sem essas conferências.</w:t>
+      </w:r>
+    </w:p>
+    <w:p>
+      <w:pPr>
+        <w:pStyle w:val="Heading2"/>
+        <w:spacing w:after="150" w:before="300"/>
+      </w:pPr>
+      <w:r>
+        <w:t xml:space="preserve">Limite de personagens</w:t>
+      </w:r>
+    </w:p>
+    <w:p>
+      <w:pPr>
+        <w:spacing w:after="150"/>
+      </w:pPr>
+      <w:r>
+        <w:t xml:space="preserve">Cada jogador pode ter até 3 personagens. Os mestres podem liberar vagas extras, na mão, até 10 no total. O jogador pode excluir um personagem quando quiser, mas a exclusão é permanente: a ficha, o XP e os ranks somem, a vaga é liberada e as rolagens antigas continuam no histórico.</w:t>
+      </w:r>
+    </w:p>
+    <w:p>
+      <w:pPr>
+        <w:pStyle w:val="Heading2"/>
+        <w:spacing w:after="150" w:before="300"/>
+      </w:pPr>
+      <w:r>
+        <w:t xml:space="preserve">Comandos dos jogadores</w:t>
+      </w:r>
+    </w:p>
+    <w:tbl>
+      <w:tblPr>
+        <w:tblW w:w="9638" w:type="dxa"/>
+        <w:tblBorders>
+          <w:top w:val="single" w:sz="4" w:space="0" w:color="auto"/>
+          <w:left w:val="single" w:sz="4" w:space="0" w:color="auto"/>
+          <w:bottom w:val="single" w:sz="4" w:space="0" w:color="auto"/>
+          <w:right w:val="single" w:sz="4" w:space="0" w:color="auto"/>
+          <w:insideH w:val="single" w:sz="4" w:space="0" w:color="auto"/>
+          <w:insideV w:val="single" w:sz="4" w:space="0" w:color="auto"/>
+        </w:tblBorders>
+        <w:tblLayout w:type="fixed"/>
+      </w:tblPr>
+      <w:tblGrid>
+        <w:gridCol w:w="2891"/>
+        <w:gridCol w:w="6747"/>
+      </w:tblGrid>
+      <w:tr>
+        <w:tc>
+          <w:tcPr>
+            <w:tcW w:w="2891" w:type="dxa"/>
+          </w:tcPr>
+          <w:p>
+            <w:pPr>
+              <w:spacing w:after="0"/>
+            </w:pPr>
+            <w:r>
+              <w:rPr>
+                <w:b/>
+                <w:bCs/>
+              </w:rPr>
+              <w:t xml:space="preserve">Comando</w:t>
+            </w:r>
+          </w:p>
+        </w:tc>
+        <w:tc>
+          <w:tcPr>
+            <w:tcW w:w="6747" w:type="dxa"/>
+          </w:tcPr>
+          <w:p>
+            <w:pPr>
+              <w:spacing w:after="0"/>
+            </w:pPr>
+            <w:r>
+              <w:rPr>
+                <w:b/>
+                <w:bCs/>
+              </w:rPr>
+              <w:t xml:space="preserve">O que faz</w:t>
+            </w:r>
+          </w:p>
+        </w:tc>
+      </w:tr>
+      <w:tr>
+        <w:tc>
+          <w:tcPr>
+            <w:tcW w:w="2891" w:type="dxa"/>
+          </w:tcPr>
+          <w:p>
+            <w:pPr>
+              <w:spacing w:after="0"/>
+            </w:pPr>
+            <w:r>
+              <w:t xml:space="preserve">/rolar</w:t>
+            </w:r>
+          </w:p>
+        </w:tc>
+        <w:tc>
+          <w:tcPr>
+            <w:tcW w:w="6747" w:type="dxa"/>
+          </w:tcPr>
+          <w:p>
+            <w:pPr>
+              <w:spacing w:after="0"/>
+            </w:pPr>
+            <w:r>
+              <w:t xml:space="preserve">Rola um dado (ex: 1d20+3) e guarda no histórico, com motivo opcional</w:t>
+            </w:r>
+          </w:p>
+        </w:tc>
+      </w:tr>
+      <w:tr>
+        <w:tc>
+          <w:tcPr>
+            <w:tcW w:w="2891" w:type="dxa"/>
+          </w:tcPr>
+          <w:p>
+            <w:pPr>
+              <w:spacing w:after="0"/>
+            </w:pPr>
+            <w:r>
+              <w:t xml:space="preserve">/historico</w:t>
+            </w:r>
+          </w:p>
+        </w:tc>
+        <w:tc>
+          <w:tcPr>
+            <w:tcW w:w="6747" w:type="dxa"/>
+          </w:tcPr>
+          <w:p>
+            <w:pPr>
+              <w:spacing w:after="0"/>
+            </w:pPr>
+            <w:r>
+              <w:t xml:space="preserve">Mostra as últimas rolagens de alguém, ou de um personagem</w:t>
+            </w:r>
+          </w:p>
+        </w:tc>
+      </w:tr>
+      <w:tr>
+        <w:tc>
+          <w:tcPr>
+            <w:tcW w:w="2891" w:type="dxa"/>
+          </w:tcPr>
+          <w:p>
+            <w:pPr>
+              <w:spacing w:after="0"/>
+            </w:pPr>
+            <w:r>
+              <w:t xml:space="preserve">/personagem criar, usar, listar, excluir</w:t>
+            </w:r>
+          </w:p>
+        </w:tc>
+        <w:tc>
+          <w:tcPr>
+            <w:tcW w:w="6747" w:type="dxa"/>
+          </w:tcPr>
+          <w:p>
+            <w:pPr>
+              <w:spacing w:after="0"/>
+            </w:pPr>
+            <w:r>
+              <w:t xml:space="preserve">Cria, troca, lista e exclui personagens</w:t>
+            </w:r>
+          </w:p>
+        </w:tc>
+      </w:tr>
+      <w:tr>
+        <w:tc>
+          <w:tcPr>
+            <w:tcW w:w="2891" w:type="dxa"/>
+          </w:tcPr>
+          <w:p>
+            <w:pPr>
+              <w:spacing w:after="0"/>
+            </w:pPr>
+            <w:r>
+              <w:t xml:space="preserve">/magia_inicial</w:t>
+            </w:r>
+          </w:p>
+        </w:tc>
+        <w:tc>
+          <w:tcPr>
+            <w:tcW w:w="6747" w:type="dxa"/>
+          </w:tcPr>
+          <w:p>
+            <w:pPr>
+              <w:spacing w:after="0"/>
+            </w:pPr>
+            <w:r>
+              <w:t xml:space="preserve">Sorteia o Rank de magia</w:t>
+            </w:r>
+          </w:p>
+        </w:tc>
+      </w:tr>
+      <w:tr>
+        <w:tc>
+          <w:tcPr>
+            <w:tcW w:w="2891" w:type="dxa"/>
+          </w:tcPr>
+          <w:p>
+            <w:pPr>
+              <w:spacing w:after="0"/>
+            </w:pPr>
+            <w:r>
+              <w:t xml:space="preserve">/raca_inicial</w:t>
+            </w:r>
+          </w:p>
+        </w:tc>
+        <w:tc>
+          <w:tcPr>
+            <w:tcW w:w="6747" w:type="dxa"/>
+          </w:tcPr>
+          <w:p>
+            <w:pPr>
+              <w:spacing w:after="0"/>
+            </w:pPr>
+            <w:r>
+              <w:t xml:space="preserve">Sorteia a Raça</w:t>
+            </w:r>
+          </w:p>
+        </w:tc>
+      </w:tr>
+      <w:tr>
+        <w:tc>
+          <w:tcPr>
+            <w:tcW w:w="2891" w:type="dxa"/>
+          </w:tcPr>
+          <w:p>
+            <w:pPr>
+              <w:spacing w:after="0"/>
+            </w:pPr>
+            <w:r>
+              <w:t xml:space="preserve">/classe_social</w:t>
+            </w:r>
+          </w:p>
+        </w:tc>
+        <w:tc>
+          <w:tcPr>
+            <w:tcW w:w="6747" w:type="dxa"/>
+          </w:tcPr>
+          <w:p>
+            <w:pPr>
+              <w:spacing w:after="0"/>
+            </w:pPr>
+            <w:r>
+              <w:t xml:space="preserve">Sorteia o Estado (e o Clero, se for 1º Estado)</w:t>
+            </w:r>
+          </w:p>
+        </w:tc>
+      </w:tr>
+      <w:tr>
+        <w:tc>
+          <w:tcPr>
+            <w:tcW w:w="2891" w:type="dxa"/>
+          </w:tcPr>
+          <w:p>
+            <w:pPr>
+              <w:spacing w:after="0"/>
+            </w:pPr>
+            <w:r>
+              <w:t xml:space="preserve">/classe</w:t>
+            </w:r>
+          </w:p>
+        </w:tc>
+        <w:tc>
+          <w:tcPr>
+            <w:tcW w:w="6747" w:type="dxa"/>
+          </w:tcPr>
+          <w:p>
+            <w:pPr>
+              <w:spacing w:after="0"/>
+            </w:pPr>
+            <w:r>
+              <w:t xml:space="preserve">Escolhe a classe do personagem (uma vez só)</w:t>
+            </w:r>
+          </w:p>
+        </w:tc>
+      </w:tr>
+      <w:tr>
+        <w:tc>
+          <w:tcPr>
+            <w:tcW w:w="2891" w:type="dxa"/>
+          </w:tcPr>
+          <w:p>
+            <w:pPr>
+              <w:spacing w:after="0"/>
+            </w:pPr>
+            <w:r>
+              <w:t xml:space="preserve">/atributos</w:t>
+            </w:r>
+          </w:p>
+        </w:tc>
+        <w:tc>
+          <w:tcPr>
+            <w:tcW w:w="6747" w:type="dxa"/>
+          </w:tcPr>
+          <w:p>
+            <w:pPr>
+              <w:spacing w:after="0"/>
+            </w:pPr>
+            <w:r>
+              <w:t xml:space="preserve">Distribui os pontos de atributo (só dá pra aumentar)</w:t>
+            </w:r>
+          </w:p>
+        </w:tc>
+      </w:tr>
+      <w:tr>
+        <w:tc>
+          <w:tcPr>
+            <w:tcW w:w="2891" w:type="dxa"/>
+          </w:tcPr>
+          <w:p>
+            <w:pPr>
+              <w:spacing w:after="0"/>
+            </w:pPr>
+            <w:r>
+              <w:t xml:space="preserve">/minha_ficha</w:t>
+            </w:r>
+          </w:p>
+        </w:tc>
+        <w:tc>
+          <w:tcPr>
+            <w:tcW w:w="6747" w:type="dxa"/>
+          </w:tcPr>
+          <w:p>
+            <w:pPr>
+              <w:spacing w:after="0"/>
+            </w:pPr>
+            <w:r>
+              <w:t xml:space="preserve">Mostra nível, XP, Raça, Classe social, Rank de magia, Classe, Atributos, Vida, Sanidade, Mana, Estamina e Ranks das perícias especiais</w:t>
+            </w:r>
+          </w:p>
+        </w:tc>
+      </w:tr>
+      <w:tr>
+        <w:tc>
+          <w:tcPr>
+            <w:tcW w:w="2891" w:type="dxa"/>
+          </w:tcPr>
+          <w:p>
+            <w:pPr>
+              <w:spacing w:after="0"/>
+            </w:pPr>
+            <w:r>
+              <w:t xml:space="preserve">/niveis</w:t>
+            </w:r>
+          </w:p>
+        </w:tc>
+        <w:tc>
+          <w:tcPr>
+            <w:tcW w:w="6747" w:type="dxa"/>
+          </w:tcPr>
+          <w:p>
+            <w:pPr>
+              <w:spacing w:after="0"/>
+            </w:pPr>
+            <w:r>
+              <w:t xml:space="preserve">Mostra o XP e as vantagens de cada nível e marca o nível do personagem</w:t>
+            </w:r>
+          </w:p>
+        </w:tc>
+      </w:tr>
+      <w:tr>
+        <w:tc>
+          <w:tcPr>
+            <w:tcW w:w="2891" w:type="dxa"/>
+          </w:tcPr>
+          <w:p>
+            <w:pPr>
+              <w:spacing w:after="0"/>
+            </w:pPr>
+            <w:r>
+              <w:t xml:space="preserve">/extrato_xp</w:t>
+            </w:r>
+          </w:p>
+        </w:tc>
+        <w:tc>
+          <w:tcPr>
+            <w:tcW w:w="6747" w:type="dxa"/>
+          </w:tcPr>
+          <w:p>
+            <w:pPr>
+              <w:spacing w:after="0"/>
+            </w:pPr>
+            <w:r>
+              <w:t xml:space="preserve">Mostra de onde veio o XP do personagem, com motivo e mestre</w:t>
+            </w:r>
+          </w:p>
+        </w:tc>
+      </w:tr>
+      <w:tr>
+        <w:tc>
+          <w:tcPr>
+            <w:tcW w:w="2891" w:type="dxa"/>
+          </w:tcPr>
+          <w:p>
+            <w:pPr>
+              <w:spacing w:after="0"/>
+            </w:pPr>
+            <w:r>
+              <w:t xml:space="preserve">/rank</w:t>
+            </w:r>
+          </w:p>
+        </w:tc>
+        <w:tc>
+          <w:tcPr>
+            <w:tcW w:w="6747" w:type="dxa"/>
+          </w:tcPr>
+          <w:p>
+            <w:pPr>
+              <w:spacing w:after="0"/>
+            </w:pPr>
+            <w:r>
+              <w:t xml:space="preserve">Rank público de XP total, de personagens ou de jogadores (soma dos personagens de cada um)</w:t>
+            </w:r>
+          </w:p>
+        </w:tc>
+      </w:tr>
+      <w:tr>
+        <w:tc>
+          <w:tcPr>
+            <w:tcW w:w="2891" w:type="dxa"/>
+          </w:tcPr>
+          <w:p>
+            <w:pPr>
+              <w:spacing w:after="0"/>
+            </w:pPr>
+            <w:r>
+              <w:t xml:space="preserve">/calcular_recursos</w:t>
+            </w:r>
+          </w:p>
+        </w:tc>
+        <w:tc>
+          <w:tcPr>
+            <w:tcW w:w="6747" w:type="dxa"/>
+          </w:tcPr>
+          <w:p>
+            <w:pPr>
+              <w:spacing w:after="0"/>
+            </w:pPr>
+            <w:r>
+              <w:t xml:space="preserve">Simula Vida, Sanidade, Mana e Estamina com os números que o jogador digitar e mostra a conta</w:t>
+            </w:r>
+          </w:p>
+        </w:tc>
+      </w:tr>
+    </w:tbl>
+    <w:p>
+      <w:pPr>
+        <w:spacing w:after="150" w:before="120"/>
+      </w:pPr>
+      <w:r>
+        <w:t xml:space="preserve">Vários comandos aceitam o campo opcional personagem: pra escolher qual personagem usar; sem ele, vale o que o jogador está usando.</w:t>
+      </w:r>
+    </w:p>
+    <w:p>
+      <w:pPr>
+        <w:pStyle w:val="Heading2"/>
+        <w:spacing w:after="150" w:before="300"/>
+      </w:pPr>
+      <w:r>
+        <w:t xml:space="preserve">Comandos dos mestres</w:t>
+      </w:r>
+    </w:p>
+    <w:p>
+      <w:pPr>
+        <w:spacing w:after="150"/>
+      </w:pPr>
+      <w:r>
+        <w:t xml:space="preserve">Cargo Mestre ou permissão de Gerenciar Servidor.</w:t>
+      </w:r>
+    </w:p>
+    <w:tbl>
+      <w:tblPr>
+        <w:tblW w:w="9638" w:type="dxa"/>
+        <w:tblBorders>
+          <w:top w:val="single" w:sz="4" w:space="0" w:color="auto"/>
+          <w:left w:val="single" w:sz="4" w:space="0" w:color="auto"/>
+          <w:bottom w:val="single" w:sz="4" w:space="0" w:color="auto"/>
+          <w:right w:val="single" w:sz="4" w:space="0" w:color="auto"/>
+          <w:insideH w:val="single" w:sz="4" w:space="0" w:color="auto"/>
+          <w:insideV w:val="single" w:sz="4" w:space="0" w:color="auto"/>
+        </w:tblBorders>
+        <w:tblLayout w:type="fixed"/>
+      </w:tblPr>
+      <w:tblGrid>
+        <w:gridCol w:w="2891"/>
+        <w:gridCol w:w="6747"/>
+      </w:tblGrid>
+      <w:tr>
+        <w:tc>
+          <w:tcPr>
+            <w:tcW w:w="2891" w:type="dxa"/>
+          </w:tcPr>
+          <w:p>
+            <w:pPr>
+              <w:spacing w:after="0"/>
+            </w:pPr>
+            <w:r>
+              <w:rPr>
+                <w:b/>
+                <w:bCs/>
+              </w:rPr>
+              <w:t xml:space="preserve">Comando</w:t>
+            </w:r>
+          </w:p>
+        </w:tc>
+        <w:tc>
+          <w:tcPr>
+            <w:tcW w:w="6747" w:type="dxa"/>
+          </w:tcPr>
+          <w:p>
+            <w:pPr>
+              <w:spacing w:after="0"/>
+            </w:pPr>
+            <w:r>
+              <w:rPr>
+                <w:b/>
+                <w:bCs/>
+              </w:rPr>
+              <w:t xml:space="preserve">O que faz</w:t>
+            </w:r>
+          </w:p>
+        </w:tc>
+      </w:tr>
+      <w:tr>
+        <w:tc>
+          <w:tcPr>
+            <w:tcW w:w="2891" w:type="dxa"/>
+          </w:tcPr>
+          <w:p>
+            <w:pPr>
+              <w:spacing w:after="0"/>
+            </w:pPr>
+            <w:r>
+              <w:t xml:space="preserve">/mestre dar_xp</w:t>
+            </w:r>
+          </w:p>
+        </w:tc>
+        <w:tc>
+          <w:tcPr>
+            <w:tcW w:w="6747" w:type="dxa"/>
+          </w:tcPr>
+          <w:p>
+            <w:pPr>
+              <w:spacing w:after="0"/>
+            </w:pPr>
+            <w:r>
+              <w:t xml:space="preserve">Dá XP a um personagem; o nível sobe sozinho. Número negativo tira XP, pra corrigir um engano</w:t>
+            </w:r>
+          </w:p>
+        </w:tc>
+      </w:tr>
+      <w:tr>
+        <w:tc>
+          <w:tcPr>
+            <w:tcW w:w="2891" w:type="dxa"/>
+          </w:tcPr>
+          <w:p>
+            <w:pPr>
+              <w:spacing w:after="0"/>
+            </w:pPr>
+            <w:r>
+              <w:t xml:space="preserve">/mestre upar</w:t>
+            </w:r>
+          </w:p>
+        </w:tc>
+        <w:tc>
+          <w:tcPr>
+            <w:tcW w:w="6747" w:type="dxa"/>
+          </w:tcPr>
+          <w:p>
+            <w:pPr>
+              <w:spacing w:after="0"/>
+            </w:pPr>
+            <w:r>
+              <w:t xml:space="preserve">Atalho: dá o XP que falta pro próximo nível</w:t>
+            </w:r>
+          </w:p>
+        </w:tc>
+      </w:tr>
+      <w:tr>
+        <w:tc>
+          <w:tcPr>
+            <w:tcW w:w="2891" w:type="dxa"/>
+          </w:tcPr>
+          <w:p>
+            <w:pPr>
+              <w:spacing w:after="0"/>
+            </w:pPr>
+            <w:r>
+              <w:t xml:space="preserve">/mestre corrigir_nivel</w:t>
+            </w:r>
+          </w:p>
+        </w:tc>
+        <w:tc>
+          <w:tcPr>
+            <w:tcW w:w="6747" w:type="dxa"/>
+          </w:tcPr>
+          <w:p>
+            <w:pPr>
+              <w:spacing w:after="0"/>
+            </w:pPr>
+            <w:r>
+              <w:t xml:space="preserve">Põe o personagem no começo de um nível</w:t>
+            </w:r>
+          </w:p>
+        </w:tc>
+      </w:tr>
+      <w:tr>
+        <w:tc>
+          <w:tcPr>
+            <w:tcW w:w="2891" w:type="dxa"/>
+          </w:tcPr>
+          <w:p>
+            <w:pPr>
+              <w:spacing w:after="0"/>
+            </w:pPr>
+            <w:r>
+              <w:t xml:space="preserve">/mestre rank_pericia</w:t>
+            </w:r>
+          </w:p>
+        </w:tc>
+        <w:tc>
+          <w:tcPr>
+            <w:tcW w:w="6747" w:type="dxa"/>
+          </w:tcPr>
+          <w:p>
+            <w:pPr>
+              <w:spacing w:after="0"/>
+            </w:pPr>
+            <w:r>
+              <w:t xml:space="preserve">Define o Rank (0 a 10) de uma perícia especial</w:t>
+            </w:r>
+          </w:p>
+        </w:tc>
+      </w:tr>
+      <w:tr>
+        <w:tc>
+          <w:tcPr>
+            <w:tcW w:w="2891" w:type="dxa"/>
+          </w:tcPr>
+          <w:p>
+            <w:pPr>
+              <w:spacing w:after="0"/>
+            </w:pPr>
+            <w:r>
+              <w:t xml:space="preserve">/mestre apagar</w:t>
+            </w:r>
+          </w:p>
+        </w:tc>
+        <w:tc>
+          <w:tcPr>
+            <w:tcW w:w="6747" w:type="dxa"/>
+          </w:tcPr>
+          <w:p>
+            <w:pPr>
+              <w:spacing w:after="0"/>
+            </w:pPr>
+            <w:r>
+              <w:t xml:space="preserve">Apaga Rank de magia, Raça, Classe social ou tudo, pro jogador rolar de novo</w:t>
+            </w:r>
+          </w:p>
+        </w:tc>
+      </w:tr>
+      <w:tr>
+        <w:tc>
+          <w:tcPr>
+            <w:tcW w:w="2891" w:type="dxa"/>
+          </w:tcPr>
+          <w:p>
+            <w:pPr>
+              <w:spacing w:after="0"/>
+            </w:pPr>
+            <w:r>
+              <w:t xml:space="preserve">/mestre corrigir_magia, corrigir_raca, corrigir_estado</w:t>
+            </w:r>
+          </w:p>
+        </w:tc>
+        <w:tc>
+          <w:tcPr>
+            <w:tcW w:w="6747" w:type="dxa"/>
+          </w:tcPr>
+          <w:p>
+            <w:pPr>
+              <w:spacing w:after="0"/>
+            </w:pPr>
+            <w:r>
+              <w:t xml:space="preserve">Define o valor na mão, sem rolar</w:t>
+            </w:r>
+          </w:p>
+        </w:tc>
+      </w:tr>
+      <w:tr>
+        <w:tc>
+          <w:tcPr>
+            <w:tcW w:w="2891" w:type="dxa"/>
+          </w:tcPr>
+          <w:p>
+            <w:pPr>
+              <w:spacing w:after="0"/>
+            </w:pPr>
+            <w:r>
+              <w:t xml:space="preserve">/mestre ficha</w:t>
+            </w:r>
+          </w:p>
+        </w:tc>
+        <w:tc>
+          <w:tcPr>
+            <w:tcW w:w="6747" w:type="dxa"/>
+          </w:tcPr>
+          <w:p>
+            <w:pPr>
+              <w:spacing w:after="0"/>
+            </w:pPr>
+            <w:r>
+              <w:t xml:space="preserve">Mostra a ficha completa de um personagem</w:t>
+            </w:r>
+          </w:p>
+        </w:tc>
+      </w:tr>
+      <w:tr>
+        <w:tc>
+          <w:tcPr>
+            <w:tcW w:w="2891" w:type="dxa"/>
+          </w:tcPr>
+          <w:p>
+            <w:pPr>
+              <w:spacing w:after="0"/>
+            </w:pPr>
+            <w:r>
+              <w:t xml:space="preserve">/mestre jogador</w:t>
+            </w:r>
+          </w:p>
+        </w:tc>
+        <w:tc>
+          <w:tcPr>
+            <w:tcW w:w="6747" w:type="dxa"/>
+          </w:tcPr>
+          <w:p>
+            <w:pPr>
+              <w:spacing w:after="0"/>
+            </w:pPr>
+            <w:r>
+              <w:t xml:space="preserve">Mostra quantos personagens o jogador tem, as vagas, o XP de cada um e quantos já excluiu</w:t>
+            </w:r>
+          </w:p>
+        </w:tc>
+      </w:tr>
+      <w:tr>
+        <w:tc>
+          <w:tcPr>
+            <w:tcW w:w="2891" w:type="dxa"/>
+          </w:tcPr>
+          <w:p>
+            <w:pPr>
+              <w:spacing w:after="0"/>
+            </w:pPr>
+            <w:r>
+              <w:t xml:space="preserve">/mestre vagas</w:t>
+            </w:r>
+          </w:p>
+        </w:tc>
+        <w:tc>
+          <w:tcPr>
+            <w:tcW w:w="6747" w:type="dxa"/>
+          </w:tcPr>
+          <w:p>
+            <w:pPr>
+              <w:spacing w:after="0"/>
+            </w:pPr>
+            <w:r>
+              <w:t xml:space="preserve">Define as vagas extras de personagem de um jogador</w:t>
+            </w:r>
+          </w:p>
+        </w:tc>
+      </w:tr>
+      <w:tr>
+        <w:tc>
+          <w:tcPr>
+            <w:tcW w:w="2891" w:type="dxa"/>
+          </w:tcPr>
+          <w:p>
+            <w:pPr>
+              <w:spacing w:after="0"/>
+            </w:pPr>
+            <w:r>
+              <w:t xml:space="preserve">/mestre excluir_personagem</w:t>
+            </w:r>
+          </w:p>
+        </w:tc>
+        <w:tc>
+          <w:tcPr>
+            <w:tcW w:w="6747" w:type="dxa"/>
+          </w:tcPr>
+          <w:p>
+            <w:pPr>
+              <w:spacing w:after="0"/>
+            </w:pPr>
+            <w:r>
+              <w:t xml:space="preserve">Exclui pra sempre o personagem de outro jogador (pede confirmação e avisa o jogador)</w:t>
+            </w:r>
+          </w:p>
+        </w:tc>
+      </w:tr>
+      <w:tr>
+        <w:tc>
+          <w:tcPr>
+            <w:tcW w:w="2891" w:type="dxa"/>
+          </w:tcPr>
+          <w:p>
+            <w:pPr>
+              <w:spacing w:after="0"/>
+            </w:pPr>
+            <w:r>
+              <w:t xml:space="preserve">/mestre atributos</w:t>
+            </w:r>
+          </w:p>
+        </w:tc>
+        <w:tc>
+          <w:tcPr>
+            <w:tcW w:w="6747" w:type="dxa"/>
+          </w:tcPr>
+          <w:p>
+            <w:pPr>
+              <w:spacing w:after="0"/>
+            </w:pPr>
+            <w:r>
+              <w:t xml:space="preserve">Define atributos na mão, sem conferir pontos nem limites (pode diminuir)</w:t>
+            </w:r>
+          </w:p>
+        </w:tc>
+      </w:tr>
+      <w:tr>
+        <w:tc>
+          <w:tcPr>
+            <w:tcW w:w="2891" w:type="dxa"/>
+          </w:tcPr>
+          <w:p>
+            <w:pPr>
+              <w:spacing w:after="0"/>
+            </w:pPr>
+            <w:r>
+              <w:t xml:space="preserve">/mestre corrigir_classe</w:t>
+            </w:r>
+          </w:p>
+        </w:tc>
+        <w:tc>
+          <w:tcPr>
+            <w:tcW w:w="6747" w:type="dxa"/>
+          </w:tcPr>
+          <w:p>
+            <w:pPr>
+              <w:spacing w:after="0"/>
+            </w:pPr>
+            <w:r>
+              <w:t xml:space="preserve">Define a classe na mão, mesmo depois de o jogador já ter escolhido</w:t>
+            </w:r>
+          </w:p>
+        </w:tc>
+      </w:tr>
+      <w:tr>
+        <w:tc>
+          <w:tcPr>
+            <w:tcW w:w="2891" w:type="dxa"/>
+          </w:tcPr>
+          <w:p>
+            <w:pPr>
+              <w:spacing w:after="0"/>
+            </w:pPr>
+            <w:r>
+              <w:t xml:space="preserve">/mestre exportar</w:t>
+            </w:r>
+          </w:p>
+        </w:tc>
+        <w:tc>
+          <w:tcPr>
+            <w:tcW w:w="6747" w:type="dxa"/>
+          </w:tcPr>
+          <w:p>
+            <w:pPr>
+              <w:spacing w:after="0"/>
+            </w:pPr>
+            <w:r>
+              <w:t xml:space="preserve">Manda ao mestre uma cópia de segurança do banco de dados (só ele vê)</w:t>
+            </w:r>
+          </w:p>
+        </w:tc>
+      </w:tr>
+    </w:tbl>
+    <w:p>
+      <w:pPr>
+        <w:spacing w:after="150" w:before="120"/>
+      </w:pPr>
+      <w:r>
+        <w:t xml:space="preserve">Toda rolagem e toda ação de mestre ficam registradas.</w:t>
+      </w:r>
+    </w:p>
+    <w:p>
+      <w:pPr>
+        <w:pStyle w:val="Heading1"/>
+        <w:spacing w:after="200" w:before="400"/>
+      </w:pPr>
+      <w:r>
+        <w:t>17. Em Aberto</w:t>
+      </w:r>
+    </w:p>
+    <w:p>
+      <w:pPr>
+        <w:spacing w:after="150"/>
+      </w:pPr>
+      <w:r>
+        <w:t xml:space="preserve">Itens ainda pendentes de definição:</w:t>
       </w:r>
     </w:p>
     <w:p>
@@ -3882,7 +6530,7 @@
         <w:spacing w:after="80"/>
       </w:pPr>
       <w:r>
-        <w:t xml:space="preserve">RP muito significativo pro personagem, reconhecido pelo grupo e pelos mestres como um marco de verdade</w:t>
+        <w:t xml:space="preserve">Economia e dinheiro</w:t>
       </w:r>
     </w:p>
     <w:p>
@@ -3895,7 +6543,7 @@
         <w:spacing w:after="80"/>
       </w:pPr>
       <w:r>
-        <w:t xml:space="preserve">Missão secundária narrada pelos mestres</w:t>
+        <w:t xml:space="preserve">Ficha de lore (documento separado)</w:t>
       </w:r>
     </w:p>
     <w:p>
@@ -3908,56 +6556,7 @@
         <w:spacing w:after="80"/>
       </w:pPr>
       <w:r>
-        <w:t xml:space="preserve">Evento</w:t>
-      </w:r>
-    </w:p>
-    <w:p>
-      <w:pPr>
-        <w:spacing w:after="150"/>
-      </w:pPr>
-      <w:r>
-        <w:t xml:space="preserve">A cada nível, o personagem ganha 2 pontos de Perícia.</w:t>
-      </w:r>
-    </w:p>
-    <w:p>
-      <w:pPr>
-        <w:spacing w:after="150"/>
-      </w:pPr>
-      <w:r>
-        <w:t xml:space="preserve">A cada 2 níveis, o personagem também ganha 1 ponto de Atributo (5 pontos no total até o nível 10) e escolhe entre criar uma habilidade nova, seguindo a mesma lógica da Habilidade Própria inicial, ou melhorar uma habilidade que já tem.</w:t>
-      </w:r>
-    </w:p>
-    <w:p>
-      <w:pPr>
-        <w:spacing w:after="150"/>
-      </w:pPr>
-      <w:r>
-        <w:t xml:space="preserve">Atributo sobe mais devagar de propósito: a progressão é pensada pra manter os personagens relativamente fracos ao longo do tempo, não pra virarem lendas em poucas sessões.</w:t>
-      </w:r>
-    </w:p>
-    <w:p>
-      <w:pPr>
-        <w:spacing w:after="150"/>
-      </w:pPr>
-      <w:r>
-        <w:t xml:space="preserve">Pontos de Atributo ganhos por nível podem ultrapassar o limite de criação (3 pro humano, 5 pro vampiro). Isso representa o personagem crescendo além do que é natural pra sua raça através da experiência, e não um erro de ficha.</w:t>
-      </w:r>
-    </w:p>
-    <w:p>
-      <w:pPr>
-        <w:pStyle w:val="Heading1"/>
-        <w:spacing w:after="200" w:before="400"/>
-      </w:pPr>
-      <w:r>
-        <w:t xml:space="preserve">14. Em Aberto</w:t>
-      </w:r>
-    </w:p>
-    <w:p>
-      <w:pPr>
-        <w:spacing w:after="150"/>
-      </w:pPr>
-      <w:r>
-        <w:t xml:space="preserve">Itens ainda pendentes de definição:</w:t>
+        <w:t xml:space="preserve">Honra e Reputação (ainda será feito)</w:t>
       </w:r>
     </w:p>
     <w:p>
@@ -3970,7 +6569,7 @@
         <w:spacing w:after="80"/>
       </w:pPr>
       <w:r>
-        <w:t xml:space="preserve">Economia e dinheiro</w:t>
+        <w:t xml:space="preserve">Limites de atributo do Dhampir</w:t>
       </w:r>
     </w:p>
     <w:p>
@@ -3983,7 +6582,7 @@
         <w:spacing w:after="80"/>
       </w:pPr>
       <w:r>
-        <w:t xml:space="preserve">Ficha de lore (documento separado)</w:t>
+        <w:t xml:space="preserve">O quanto as fraquezas que o Dhampir mantém são mais fracas que as do vampiro</w:t>
       </w:r>
     </w:p>
     <w:p>
@@ -3996,7 +6595,20 @@
         <w:spacing w:after="80"/>
       </w:pPr>
       <w:r>
-        <w:t xml:space="preserve">Honra e Reputação (ainda será feito)</w:t>
+        <w:t xml:space="preserve">Vantagens e restrições de cada Estado e de Alto e Baixo Clero</w:t>
+      </w:r>
+    </w:p>
+    <w:p>
+      <w:pPr>
+        <w:pStyle w:val="ListParagraph"/>
+        <w:numPr>
+          <w:ilvl w:val="0"/>
+          <w:numId w:val="1"/>
+        </w:numPr>
+        <w:spacing w:after="80"/>
+      </w:pPr>
+      <w:r>
+        <w:t xml:space="preserve">As Disciplinas vampíricas (grau 0 a 5) ainda não aparecem na ficha do bot</w:t>
       </w:r>
     </w:p>
     <w:sectPr>

</xml_diff>